<commit_message>
reactualizat CV in ambele formate
</commit_message>
<xml_diff>
--- a/assets/cv/CV Mihai Ioan Sandor.docx
+++ b/assets/cv/CV Mihai Ioan Sandor.docx
@@ -942,7 +942,7 @@
           </mc:Choice>
           <mc:Fallback>
             <w:pict>
-              <v:shape w14:anchorId="1B21456C" id="Graphic 11" o:spid="_x0000_s1026" style="position:absolute;margin-left:28.35pt;margin-top:16.4pt;width:552.8pt;height:1pt;z-index:-251898880;visibility:visible;mso-wrap-style:square;mso-wrap-distance-left:0;mso-wrap-distance-top:0;mso-wrap-distance-right:0;mso-wrap-distance-bottom:0;mso-position-horizontal:absolute;mso-position-horizontal-relative:page;mso-position-vertical:absolute;mso-position-vertical-relative:text;v-text-anchor:top" coordsize="7020559,12700" o:gfxdata="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" path="m7020013,12700l,12700,,,7020013,r,12700xe" fillcolor="#5e3672" stroked="f">
+              <v:shape w14:anchorId="5CFC1B6C" id="Graphic 11" o:spid="_x0000_s1026" style="position:absolute;margin-left:28.35pt;margin-top:16.4pt;width:552.8pt;height:1pt;z-index:-251898880;visibility:visible;mso-wrap-style:square;mso-wrap-distance-left:0;mso-wrap-distance-top:0;mso-wrap-distance-right:0;mso-wrap-distance-bottom:0;mso-position-horizontal:absolute;mso-position-horizontal-relative:page;mso-position-vertical:absolute;mso-position-vertical-relative:text;v-text-anchor:top" coordsize="7020559,12700" o:gfxdata="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" path="m7020013,12700l,12700,,,7020013,r,12700xe" fillcolor="#5e3672" stroked="f">
                 <v:path arrowok="t"/>
                 <w10:wrap type="topAndBottom" anchorx="page"/>
               </v:shape>
@@ -1121,7 +1121,7 @@
         <mc:AlternateContent>
           <mc:Choice Requires="wps">
             <w:drawing>
-              <wp:anchor distT="0" distB="0" distL="0" distR="0" simplePos="0" relativeHeight="251426816" behindDoc="1" locked="0" layoutInCell="1" allowOverlap="1" wp14:anchorId="532C9BA8" wp14:editId="4979FBA8">
+              <wp:anchor distT="0" distB="0" distL="0" distR="0" simplePos="0" relativeHeight="251426816" behindDoc="1" locked="0" layoutInCell="1" allowOverlap="1" wp14:anchorId="532C9BA8" wp14:editId="43276194">
                 <wp:simplePos x="0" y="0"/>
                 <wp:positionH relativeFrom="page">
                   <wp:posOffset>360019</wp:posOffset>
@@ -1192,7 +1192,7 @@
           </mc:Choice>
           <mc:Fallback>
             <w:pict>
-              <v:shape w14:anchorId="08CB7F85" id="Graphic 11" o:spid="_x0000_s1026" style="position:absolute;margin-left:28.35pt;margin-top:16.4pt;width:552.8pt;height:1pt;z-index:-251889664;visibility:visible;mso-wrap-style:square;mso-wrap-distance-left:0;mso-wrap-distance-top:0;mso-wrap-distance-right:0;mso-wrap-distance-bottom:0;mso-position-horizontal:absolute;mso-position-horizontal-relative:page;mso-position-vertical:absolute;mso-position-vertical-relative:text;v-text-anchor:top" coordsize="7020559,12700" o:gfxdata="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" path="m7020013,12700l,12700,,,7020013,r,12700xe" fillcolor="#5e3672" stroked="f">
+              <v:shape w14:anchorId="02B5EADF" id="Graphic 11" o:spid="_x0000_s1026" style="position:absolute;margin-left:28.35pt;margin-top:16.4pt;width:552.8pt;height:1pt;z-index:-251889664;visibility:visible;mso-wrap-style:square;mso-wrap-distance-left:0;mso-wrap-distance-top:0;mso-wrap-distance-right:0;mso-wrap-distance-bottom:0;mso-position-horizontal:absolute;mso-position-horizontal-relative:page;mso-position-vertical:absolute;mso-position-vertical-relative:text;v-text-anchor:top" coordsize="7020559,12700" o:gfxdata="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" path="m7020013,12700l,12700,,,7020013,r,12700xe" fillcolor="#5e3672" stroked="f">
                 <v:path arrowok="t"/>
                 <w10:wrap type="topAndBottom" anchorx="page"/>
               </v:shape>
@@ -1220,18 +1220,18 @@
           <w:noProof/>
         </w:rPr>
         <w:drawing>
-          <wp:anchor distT="0" distB="0" distL="114300" distR="114300" simplePos="0" relativeHeight="251524096" behindDoc="0" locked="0" layoutInCell="1" allowOverlap="1" wp14:anchorId="2EC6B24A" wp14:editId="5A978E73">
+          <wp:anchor distT="0" distB="0" distL="114300" distR="114300" simplePos="0" relativeHeight="251661312" behindDoc="0" locked="0" layoutInCell="1" allowOverlap="1" wp14:anchorId="4DB8E44C" wp14:editId="05C4B696">
             <wp:simplePos x="0" y="0"/>
             <wp:positionH relativeFrom="column">
-              <wp:posOffset>4565699</wp:posOffset>
+              <wp:posOffset>5525770</wp:posOffset>
             </wp:positionH>
             <wp:positionV relativeFrom="paragraph">
-              <wp:posOffset>91636</wp:posOffset>
+              <wp:posOffset>209550</wp:posOffset>
             </wp:positionV>
-            <wp:extent cx="779584" cy="779584"/>
-            <wp:effectExtent l="0" t="0" r="1905" b="0"/>
+            <wp:extent cx="931984" cy="314995"/>
+            <wp:effectExtent l="0" t="0" r="1905" b="8890"/>
             <wp:wrapNone/>
-            <wp:docPr id="51" name="Picture 51"/>
+            <wp:docPr id="50" name="Picture 50"/>
             <wp:cNvGraphicFramePr>
               <a:graphicFrameLocks xmlns:a="http://schemas.openxmlformats.org/drawingml/2006/main" noChangeAspect="1"/>
             </wp:cNvGraphicFramePr>
@@ -1239,7 +1239,7 @@
               <a:graphicData uri="http://schemas.openxmlformats.org/drawingml/2006/picture">
                 <pic:pic xmlns:pic="http://schemas.openxmlformats.org/drawingml/2006/picture">
                   <pic:nvPicPr>
-                    <pic:cNvPr id="51" name="Picture 51"/>
+                    <pic:cNvPr id="50" name="Picture 50"/>
                     <pic:cNvPicPr/>
                   </pic:nvPicPr>
                   <pic:blipFill>
@@ -1257,7 +1257,7 @@
                   <pic:spPr>
                     <a:xfrm>
                       <a:off x="0" y="0"/>
-                      <a:ext cx="779584" cy="779584"/>
+                      <a:ext cx="931984" cy="314995"/>
                     </a:xfrm>
                     <a:prstGeom prst="rect">
                       <a:avLst/>
@@ -1280,10 +1280,70 @@
           <w:noProof/>
         </w:rPr>
         <w:drawing>
-          <wp:anchor distT="0" distB="0" distL="114300" distR="114300" simplePos="0" relativeHeight="251445248" behindDoc="0" locked="0" layoutInCell="1" allowOverlap="1" wp14:anchorId="791BFB3F" wp14:editId="495F8212">
+          <wp:anchor distT="0" distB="0" distL="114300" distR="114300" simplePos="0" relativeHeight="251643904" behindDoc="0" locked="0" layoutInCell="1" allowOverlap="1" wp14:anchorId="2AD30ED2" wp14:editId="75AD77A9">
             <wp:simplePos x="0" y="0"/>
             <wp:positionH relativeFrom="column">
-              <wp:posOffset>6505575</wp:posOffset>
+              <wp:posOffset>6591300</wp:posOffset>
+            </wp:positionH>
+            <wp:positionV relativeFrom="paragraph">
+              <wp:posOffset>187325</wp:posOffset>
+            </wp:positionV>
+            <wp:extent cx="627185" cy="408901"/>
+            <wp:effectExtent l="0" t="0" r="1905" b="0"/>
+            <wp:wrapNone/>
+            <wp:docPr id="45" name="Picture 45"/>
+            <wp:cNvGraphicFramePr>
+              <a:graphicFrameLocks xmlns:a="http://schemas.openxmlformats.org/drawingml/2006/main" noChangeAspect="1"/>
+            </wp:cNvGraphicFramePr>
+            <a:graphic xmlns:a="http://schemas.openxmlformats.org/drawingml/2006/main">
+              <a:graphicData uri="http://schemas.openxmlformats.org/drawingml/2006/picture">
+                <pic:pic xmlns:pic="http://schemas.openxmlformats.org/drawingml/2006/picture">
+                  <pic:nvPicPr>
+                    <pic:cNvPr id="45" name="Picture 45"/>
+                    <pic:cNvPicPr/>
+                  </pic:nvPicPr>
+                  <pic:blipFill>
+                    <a:blip r:embed="rId13" cstate="print">
+                      <a:extLst>
+                        <a:ext uri="{28A0092B-C50C-407E-A947-70E740481C1C}">
+                          <a14:useLocalDpi xmlns:a14="http://schemas.microsoft.com/office/drawing/2010/main" val="0"/>
+                        </a:ext>
+                      </a:extLst>
+                    </a:blip>
+                    <a:stretch>
+                      <a:fillRect/>
+                    </a:stretch>
+                  </pic:blipFill>
+                  <pic:spPr>
+                    <a:xfrm>
+                      <a:off x="0" y="0"/>
+                      <a:ext cx="627185" cy="408901"/>
+                    </a:xfrm>
+                    <a:prstGeom prst="rect">
+                      <a:avLst/>
+                    </a:prstGeom>
+                  </pic:spPr>
+                </pic:pic>
+              </a:graphicData>
+            </a:graphic>
+            <wp14:sizeRelH relativeFrom="margin">
+              <wp14:pctWidth>0</wp14:pctWidth>
+            </wp14:sizeRelH>
+            <wp14:sizeRelV relativeFrom="margin">
+              <wp14:pctHeight>0</wp14:pctHeight>
+            </wp14:sizeRelV>
+          </wp:anchor>
+        </w:drawing>
+      </w:r>
+      <w:r>
+        <w:rPr>
+          <w:noProof/>
+        </w:rPr>
+        <w:drawing>
+          <wp:anchor distT="0" distB="0" distL="114300" distR="114300" simplePos="0" relativeHeight="251632640" behindDoc="0" locked="0" layoutInCell="1" allowOverlap="1" wp14:anchorId="791BFB3F" wp14:editId="002DC0EB">
+            <wp:simplePos x="0" y="0"/>
+            <wp:positionH relativeFrom="column">
+              <wp:posOffset>4768215</wp:posOffset>
             </wp:positionH>
             <wp:positionV relativeFrom="paragraph">
               <wp:posOffset>205740</wp:posOffset>
@@ -1303,7 +1363,7 @@
                     <pic:cNvPicPr/>
                   </pic:nvPicPr>
                   <pic:blipFill>
-                    <a:blip r:embed="rId13" cstate="print">
+                    <a:blip r:embed="rId14" cstate="print">
                       <a:extLst>
                         <a:ext uri="{28A0092B-C50C-407E-A947-70E740481C1C}">
                           <a14:useLocalDpi xmlns:a14="http://schemas.microsoft.com/office/drawing/2010/main" val="0"/>
@@ -1337,66 +1397,6 @@
       </w:r>
       <w:r>
         <w:rPr>
-          <w:noProof/>
-        </w:rPr>
-        <w:drawing>
-          <wp:anchor distT="0" distB="0" distL="114300" distR="114300" simplePos="0" relativeHeight="251501568" behindDoc="0" locked="0" layoutInCell="1" allowOverlap="1" wp14:anchorId="0D2FFBA6" wp14:editId="71FC8571">
-            <wp:simplePos x="0" y="0"/>
-            <wp:positionH relativeFrom="column">
-              <wp:posOffset>5480441</wp:posOffset>
-            </wp:positionH>
-            <wp:positionV relativeFrom="paragraph">
-              <wp:posOffset>203200</wp:posOffset>
-            </wp:positionV>
-            <wp:extent cx="632775" cy="504092"/>
-            <wp:effectExtent l="0" t="0" r="0" b="0"/>
-            <wp:wrapNone/>
-            <wp:docPr id="46" name="Picture 46"/>
-            <wp:cNvGraphicFramePr>
-              <a:graphicFrameLocks xmlns:a="http://schemas.openxmlformats.org/drawingml/2006/main" noChangeAspect="1"/>
-            </wp:cNvGraphicFramePr>
-            <a:graphic xmlns:a="http://schemas.openxmlformats.org/drawingml/2006/main">
-              <a:graphicData uri="http://schemas.openxmlformats.org/drawingml/2006/picture">
-                <pic:pic xmlns:pic="http://schemas.openxmlformats.org/drawingml/2006/picture">
-                  <pic:nvPicPr>
-                    <pic:cNvPr id="46" name="Picture 46"/>
-                    <pic:cNvPicPr/>
-                  </pic:nvPicPr>
-                  <pic:blipFill>
-                    <a:blip r:embed="rId14" cstate="print">
-                      <a:extLst>
-                        <a:ext uri="{28A0092B-C50C-407E-A947-70E740481C1C}">
-                          <a14:useLocalDpi xmlns:a14="http://schemas.microsoft.com/office/drawing/2010/main" val="0"/>
-                        </a:ext>
-                      </a:extLst>
-                    </a:blip>
-                    <a:stretch>
-                      <a:fillRect/>
-                    </a:stretch>
-                  </pic:blipFill>
-                  <pic:spPr>
-                    <a:xfrm>
-                      <a:off x="0" y="0"/>
-                      <a:ext cx="632775" cy="504092"/>
-                    </a:xfrm>
-                    <a:prstGeom prst="rect">
-                      <a:avLst/>
-                    </a:prstGeom>
-                  </pic:spPr>
-                </pic:pic>
-              </a:graphicData>
-            </a:graphic>
-            <wp14:sizeRelH relativeFrom="margin">
-              <wp14:pctWidth>0</wp14:pctWidth>
-            </wp14:sizeRelH>
-            <wp14:sizeRelV relativeFrom="margin">
-              <wp14:pctHeight>0</wp14:pctHeight>
-            </wp14:sizeRelV>
-          </wp:anchor>
-        </w:drawing>
-      </w:r>
-      <w:r>
-        <w:rPr>
           <w:b/>
           <w:bCs/>
         </w:rPr>
@@ -1432,92 +1432,23 @@
         </w:tabs>
         <w:ind w:left="1003"/>
       </w:pPr>
-      <w:proofErr w:type="spellStart"/>
-      <w:r>
-        <w:rPr>
-          <w:rStyle w:val="citation-20"/>
-          <w:b/>
-          <w:bCs/>
-        </w:rPr>
-        <w:t>Expertiză</w:t>
-      </w:r>
-      <w:proofErr w:type="spellEnd"/>
-      <w:r>
-        <w:rPr>
-          <w:rStyle w:val="citation-20"/>
-          <w:b/>
-          <w:bCs/>
-        </w:rPr>
-        <w:t xml:space="preserve"> CAM:</w:t>
-      </w:r>
-      <w:r>
-        <w:rPr>
-          <w:rStyle w:val="citation-20"/>
-        </w:rPr>
-        <w:t xml:space="preserve"> </w:t>
-      </w:r>
-      <w:proofErr w:type="spellStart"/>
-      <w:r>
-        <w:rPr>
-          <w:rStyle w:val="citation-20"/>
-        </w:rPr>
-        <w:t>Tebis</w:t>
-      </w:r>
-      <w:proofErr w:type="spellEnd"/>
-      <w:r>
-        <w:rPr>
-          <w:rStyle w:val="citation-20"/>
-        </w:rPr>
-        <w:t xml:space="preserve"> AG, NCG </w:t>
-      </w:r>
-      <w:proofErr w:type="spellStart"/>
-      <w:r>
-        <w:rPr>
-          <w:rStyle w:val="citation-20"/>
-        </w:rPr>
-        <w:t>DepoCam</w:t>
-      </w:r>
-      <w:proofErr w:type="spellEnd"/>
-      <w:r>
-        <w:rPr>
-          <w:rStyle w:val="citation-20"/>
-        </w:rPr>
-        <w:t>, Mastercam</w:t>
-      </w:r>
-      <w:r>
-        <w:t xml:space="preserve">. </w:t>
-      </w:r>
-    </w:p>
-    <w:p>
-      <w:pPr>
-        <w:pStyle w:val="NormalWeb"/>
-        <w:numPr>
-          <w:ilvl w:val="0"/>
-          <w:numId w:val="3"/>
-        </w:numPr>
-        <w:tabs>
-          <w:tab w:val="clear" w:pos="720"/>
-          <w:tab w:val="num" w:pos="1003"/>
-        </w:tabs>
-        <w:ind w:left="1003"/>
-      </w:pPr>
       <w:r>
         <w:rPr>
           <w:noProof/>
         </w:rPr>
         <w:drawing>
-          <wp:anchor distT="0" distB="0" distL="114300" distR="114300" simplePos="0" relativeHeight="251512832" behindDoc="0" locked="0" layoutInCell="1" allowOverlap="1" wp14:anchorId="4DB8E44C" wp14:editId="65927E42">
+          <wp:anchor distT="0" distB="0" distL="114300" distR="114300" simplePos="0" relativeHeight="251675648" behindDoc="0" locked="0" layoutInCell="1" allowOverlap="1" wp14:anchorId="2EC6B24A" wp14:editId="2A50C9D2">
             <wp:simplePos x="0" y="0"/>
             <wp:positionH relativeFrom="column">
-              <wp:posOffset>5333610</wp:posOffset>
+              <wp:posOffset>6386830</wp:posOffset>
             </wp:positionH>
             <wp:positionV relativeFrom="paragraph">
-              <wp:posOffset>95592</wp:posOffset>
+              <wp:posOffset>76835</wp:posOffset>
             </wp:positionV>
-            <wp:extent cx="931984" cy="314995"/>
-            <wp:effectExtent l="0" t="0" r="1905" b="8890"/>
+            <wp:extent cx="779145" cy="779145"/>
+            <wp:effectExtent l="0" t="0" r="1905" b="0"/>
             <wp:wrapNone/>
-            <wp:docPr id="50" name="Picture 50"/>
+            <wp:docPr id="51" name="Picture 51"/>
             <wp:cNvGraphicFramePr>
               <a:graphicFrameLocks xmlns:a="http://schemas.openxmlformats.org/drawingml/2006/main" noChangeAspect="1"/>
             </wp:cNvGraphicFramePr>
@@ -1525,7 +1456,7 @@
               <a:graphicData uri="http://schemas.openxmlformats.org/drawingml/2006/picture">
                 <pic:pic xmlns:pic="http://schemas.openxmlformats.org/drawingml/2006/picture">
                   <pic:nvPicPr>
-                    <pic:cNvPr id="50" name="Picture 50"/>
+                    <pic:cNvPr id="51" name="Picture 51"/>
                     <pic:cNvPicPr/>
                   </pic:nvPicPr>
                   <pic:blipFill>
@@ -1543,7 +1474,7 @@
                   <pic:spPr>
                     <a:xfrm>
                       <a:off x="0" y="0"/>
-                      <a:ext cx="931984" cy="314995"/>
+                      <a:ext cx="779145" cy="779145"/>
                     </a:xfrm>
                     <a:prstGeom prst="rect">
                       <a:avLst/>
@@ -1561,23 +1492,92 @@
           </wp:anchor>
         </w:drawing>
       </w:r>
+      <w:proofErr w:type="spellStart"/>
+      <w:r>
+        <w:rPr>
+          <w:rStyle w:val="citation-20"/>
+          <w:b/>
+          <w:bCs/>
+        </w:rPr>
+        <w:t>Expertiză</w:t>
+      </w:r>
+      <w:proofErr w:type="spellEnd"/>
+      <w:r>
+        <w:rPr>
+          <w:rStyle w:val="citation-20"/>
+          <w:b/>
+          <w:bCs/>
+        </w:rPr>
+        <w:t xml:space="preserve"> CAM:</w:t>
+      </w:r>
+      <w:r>
+        <w:rPr>
+          <w:rStyle w:val="citation-20"/>
+        </w:rPr>
+        <w:t xml:space="preserve"> </w:t>
+      </w:r>
+      <w:proofErr w:type="spellStart"/>
+      <w:r>
+        <w:rPr>
+          <w:rStyle w:val="citation-20"/>
+        </w:rPr>
+        <w:t>Tebis</w:t>
+      </w:r>
+      <w:proofErr w:type="spellEnd"/>
+      <w:r>
+        <w:rPr>
+          <w:rStyle w:val="citation-20"/>
+        </w:rPr>
+        <w:t xml:space="preserve"> AG, NCG </w:t>
+      </w:r>
+      <w:proofErr w:type="spellStart"/>
+      <w:r>
+        <w:rPr>
+          <w:rStyle w:val="citation-20"/>
+        </w:rPr>
+        <w:t>DepoCam</w:t>
+      </w:r>
+      <w:proofErr w:type="spellEnd"/>
+      <w:r>
+        <w:rPr>
+          <w:rStyle w:val="citation-20"/>
+        </w:rPr>
+        <w:t>, Mastercam</w:t>
+      </w:r>
+      <w:r>
+        <w:t xml:space="preserve">. </w:t>
+      </w:r>
+    </w:p>
+    <w:p>
+      <w:pPr>
+        <w:pStyle w:val="NormalWeb"/>
+        <w:numPr>
+          <w:ilvl w:val="0"/>
+          <w:numId w:val="3"/>
+        </w:numPr>
+        <w:tabs>
+          <w:tab w:val="clear" w:pos="720"/>
+          <w:tab w:val="num" w:pos="1003"/>
+        </w:tabs>
+        <w:ind w:left="1003"/>
+      </w:pPr>
       <w:r>
         <w:rPr>
           <w:noProof/>
         </w:rPr>
         <w:drawing>
-          <wp:anchor distT="0" distB="0" distL="114300" distR="114300" simplePos="0" relativeHeight="251486208" behindDoc="0" locked="0" layoutInCell="1" allowOverlap="1" wp14:anchorId="2AD30ED2" wp14:editId="39EBD2A0">
+          <wp:anchor distT="0" distB="0" distL="114300" distR="114300" simplePos="0" relativeHeight="251654144" behindDoc="0" locked="0" layoutInCell="1" allowOverlap="1" wp14:anchorId="0D2FFBA6" wp14:editId="6169F2D5">
             <wp:simplePos x="0" y="0"/>
             <wp:positionH relativeFrom="column">
-              <wp:posOffset>6523111</wp:posOffset>
+              <wp:posOffset>5617210</wp:posOffset>
             </wp:positionH>
             <wp:positionV relativeFrom="paragraph">
-              <wp:posOffset>41910</wp:posOffset>
+              <wp:posOffset>7620</wp:posOffset>
             </wp:positionV>
-            <wp:extent cx="627185" cy="408901"/>
-            <wp:effectExtent l="0" t="0" r="1905" b="0"/>
+            <wp:extent cx="632460" cy="503555"/>
+            <wp:effectExtent l="0" t="0" r="0" b="0"/>
             <wp:wrapNone/>
-            <wp:docPr id="45" name="Picture 45"/>
+            <wp:docPr id="46" name="Picture 46"/>
             <wp:cNvGraphicFramePr>
               <a:graphicFrameLocks xmlns:a="http://schemas.openxmlformats.org/drawingml/2006/main" noChangeAspect="1"/>
             </wp:cNvGraphicFramePr>
@@ -1585,7 +1585,7 @@
               <a:graphicData uri="http://schemas.openxmlformats.org/drawingml/2006/picture">
                 <pic:pic xmlns:pic="http://schemas.openxmlformats.org/drawingml/2006/picture">
                   <pic:nvPicPr>
-                    <pic:cNvPr id="45" name="Picture 45"/>
+                    <pic:cNvPr id="46" name="Picture 46"/>
                     <pic:cNvPicPr/>
                   </pic:nvPicPr>
                   <pic:blipFill>
@@ -1603,7 +1603,7 @@
                   <pic:spPr>
                     <a:xfrm>
                       <a:off x="0" y="0"/>
-                      <a:ext cx="627185" cy="408901"/>
+                      <a:ext cx="632460" cy="503555"/>
                     </a:xfrm>
                     <a:prstGeom prst="rect">
                       <a:avLst/>
@@ -2532,18 +2532,18 @@
           <w:noProof/>
         </w:rPr>
         <w:drawing>
-          <wp:anchor distT="0" distB="0" distL="114300" distR="114300" simplePos="0" relativeHeight="251797504" behindDoc="0" locked="0" layoutInCell="1" allowOverlap="1" wp14:anchorId="7CBA728A" wp14:editId="7BE0F012">
+          <wp:anchor distT="0" distB="0" distL="114300" distR="114300" simplePos="0" relativeHeight="251684864" behindDoc="0" locked="0" layoutInCell="1" allowOverlap="1" wp14:anchorId="410856AB" wp14:editId="3658B4AA">
             <wp:simplePos x="0" y="0"/>
             <wp:positionH relativeFrom="column">
-              <wp:posOffset>1863627</wp:posOffset>
+              <wp:posOffset>4427220</wp:posOffset>
             </wp:positionH>
             <wp:positionV relativeFrom="paragraph">
-              <wp:posOffset>419539</wp:posOffset>
+              <wp:posOffset>85725</wp:posOffset>
             </wp:positionV>
-            <wp:extent cx="1406769" cy="385727"/>
-            <wp:effectExtent l="0" t="0" r="3175" b="0"/>
+            <wp:extent cx="1463040" cy="975267"/>
+            <wp:effectExtent l="0" t="0" r="0" b="0"/>
             <wp:wrapNone/>
-            <wp:docPr id="76" name="Graphic 76"/>
+            <wp:docPr id="75" name="Picture 75"/>
             <wp:cNvGraphicFramePr>
               <a:graphicFrameLocks xmlns:a="http://schemas.openxmlformats.org/drawingml/2006/main" noChangeAspect="1"/>
             </wp:cNvGraphicFramePr>
@@ -2551,7 +2551,7 @@
               <a:graphicData uri="http://schemas.openxmlformats.org/drawingml/2006/picture">
                 <pic:pic xmlns:pic="http://schemas.openxmlformats.org/drawingml/2006/picture">
                   <pic:nvPicPr>
-                    <pic:cNvPr id="76" name="Graphic 76"/>
+                    <pic:cNvPr id="75" name="Picture 75"/>
                     <pic:cNvPicPr/>
                   </pic:nvPicPr>
                   <pic:blipFill>
@@ -2559,9 +2559,6 @@
                       <a:extLst>
                         <a:ext uri="{28A0092B-C50C-407E-A947-70E740481C1C}">
                           <a14:useLocalDpi xmlns:a14="http://schemas.microsoft.com/office/drawing/2010/main" val="0"/>
-                        </a:ext>
-                        <a:ext uri="{96DAC541-7B7A-43D3-8B79-37D633B846F1}">
-                          <asvg:svgBlip xmlns:asvg="http://schemas.microsoft.com/office/drawing/2016/SVG/main" r:embed="rId27"/>
                         </a:ext>
                       </a:extLst>
                     </a:blip>
@@ -2572,7 +2569,7 @@
                   <pic:spPr>
                     <a:xfrm>
                       <a:off x="0" y="0"/>
-                      <a:ext cx="1406769" cy="385727"/>
+                      <a:ext cx="1463040" cy="975267"/>
                     </a:xfrm>
                     <a:prstGeom prst="rect">
                       <a:avLst/>
@@ -2595,18 +2592,18 @@
           <w:noProof/>
         </w:rPr>
         <w:drawing>
-          <wp:anchor distT="0" distB="0" distL="114300" distR="114300" simplePos="0" relativeHeight="251787264" behindDoc="0" locked="0" layoutInCell="1" allowOverlap="1" wp14:anchorId="410856AB" wp14:editId="09CFED32">
+          <wp:anchor distT="0" distB="0" distL="114300" distR="114300" simplePos="0" relativeHeight="251686912" behindDoc="0" locked="0" layoutInCell="1" allowOverlap="1" wp14:anchorId="7CBA728A" wp14:editId="39EA1883">
             <wp:simplePos x="0" y="0"/>
             <wp:positionH relativeFrom="column">
-              <wp:posOffset>3704151</wp:posOffset>
+              <wp:posOffset>1859281</wp:posOffset>
             </wp:positionH>
             <wp:positionV relativeFrom="paragraph">
-              <wp:posOffset>97497</wp:posOffset>
+              <wp:posOffset>421006</wp:posOffset>
             </wp:positionV>
-            <wp:extent cx="1547595" cy="1031631"/>
+            <wp:extent cx="1181100" cy="323850"/>
             <wp:effectExtent l="0" t="0" r="0" b="0"/>
             <wp:wrapNone/>
-            <wp:docPr id="75" name="Picture 75"/>
+            <wp:docPr id="76" name="Graphic 76"/>
             <wp:cNvGraphicFramePr>
               <a:graphicFrameLocks xmlns:a="http://schemas.openxmlformats.org/drawingml/2006/main" noChangeAspect="1"/>
             </wp:cNvGraphicFramePr>
@@ -2614,14 +2611,17 @@
               <a:graphicData uri="http://schemas.openxmlformats.org/drawingml/2006/picture">
                 <pic:pic xmlns:pic="http://schemas.openxmlformats.org/drawingml/2006/picture">
                   <pic:nvPicPr>
-                    <pic:cNvPr id="75" name="Picture 75"/>
+                    <pic:cNvPr id="76" name="Graphic 76"/>
                     <pic:cNvPicPr/>
                   </pic:nvPicPr>
                   <pic:blipFill>
-                    <a:blip r:embed="rId28" cstate="print">
+                    <a:blip r:embed="rId27" cstate="print">
                       <a:extLst>
                         <a:ext uri="{28A0092B-C50C-407E-A947-70E740481C1C}">
                           <a14:useLocalDpi xmlns:a14="http://schemas.microsoft.com/office/drawing/2010/main" val="0"/>
+                        </a:ext>
+                        <a:ext uri="{96DAC541-7B7A-43D3-8B79-37D633B846F1}">
+                          <asvg:svgBlip xmlns:asvg="http://schemas.microsoft.com/office/drawing/2016/SVG/main" r:embed="rId28"/>
                         </a:ext>
                       </a:extLst>
                     </a:blip>
@@ -2632,7 +2632,7 @@
                   <pic:spPr>
                     <a:xfrm>
                       <a:off x="0" y="0"/>
-                      <a:ext cx="1547595" cy="1031631"/>
+                      <a:ext cx="1196720" cy="328133"/>
                     </a:xfrm>
                     <a:prstGeom prst="rect">
                       <a:avLst/>
@@ -3369,7 +3369,7 @@
           </mc:Choice>
           <mc:Fallback>
             <w:pict>
-              <v:shape w14:anchorId="3D700ACD" id="Graphic 11" o:spid="_x0000_s1026" style="position:absolute;margin-left:28.35pt;margin-top:16.4pt;width:552.8pt;height:1pt;z-index:-251867136;visibility:visible;mso-wrap-style:square;mso-wrap-distance-left:0;mso-wrap-distance-top:0;mso-wrap-distance-right:0;mso-wrap-distance-bottom:0;mso-position-horizontal:absolute;mso-position-horizontal-relative:page;mso-position-vertical:absolute;mso-position-vertical-relative:text;v-text-anchor:top" coordsize="7020559,12700" o:gfxdata="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" path="m7020013,12700l,12700,,,7020013,r,12700xe" fillcolor="#5e3672" stroked="f">
+              <v:shape w14:anchorId="00924E51" id="Graphic 11" o:spid="_x0000_s1026" style="position:absolute;margin-left:28.35pt;margin-top:16.4pt;width:552.8pt;height:1pt;z-index:-251867136;visibility:visible;mso-wrap-style:square;mso-wrap-distance-left:0;mso-wrap-distance-top:0;mso-wrap-distance-right:0;mso-wrap-distance-bottom:0;mso-position-horizontal:absolute;mso-position-horizontal-relative:page;mso-position-vertical:absolute;mso-position-vertical-relative:text;v-text-anchor:top" coordsize="7020559,12700" o:gfxdata="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" path="m7020013,12700l,12700,,,7020013,r,12700xe" fillcolor="#5e3672" stroked="f">
                 <v:path arrowok="t"/>
                 <w10:wrap type="topAndBottom" anchorx="page"/>
               </v:shape>
@@ -3424,13 +3424,13 @@
           <w:sz w:val="18"/>
         </w:rPr>
         <w:drawing>
-          <wp:anchor distT="0" distB="0" distL="114300" distR="114300" simplePos="0" relativeHeight="251548672" behindDoc="0" locked="0" layoutInCell="1" allowOverlap="1" wp14:anchorId="5576E52C" wp14:editId="517915A8">
+          <wp:anchor distT="0" distB="0" distL="114300" distR="114300" simplePos="0" relativeHeight="251677696" behindDoc="0" locked="0" layoutInCell="1" allowOverlap="1" wp14:anchorId="5576E52C" wp14:editId="3629D994">
             <wp:simplePos x="0" y="0"/>
             <wp:positionH relativeFrom="column">
-              <wp:posOffset>4032641</wp:posOffset>
+              <wp:posOffset>4626610</wp:posOffset>
             </wp:positionH>
             <wp:positionV relativeFrom="paragraph">
-              <wp:posOffset>115179</wp:posOffset>
+              <wp:posOffset>168275</wp:posOffset>
             </wp:positionV>
             <wp:extent cx="1371600" cy="575969"/>
             <wp:effectExtent l="0" t="0" r="0" b="0"/>
@@ -3484,7 +3484,6 @@
           <w:color w:val="565656"/>
           <w:w w:val="90"/>
           <w:sz w:val="18"/>
-          <w:highlight w:val="yellow"/>
         </w:rPr>
         <w:t>HUNEDOARA,</w:t>
       </w:r>
@@ -3494,7 +3493,6 @@
           <w:spacing w:val="-7"/>
           <w:w w:val="90"/>
           <w:sz w:val="18"/>
-          <w:highlight w:val="yellow"/>
         </w:rPr>
         <w:t xml:space="preserve"> </w:t>
       </w:r>
@@ -3504,7 +3502,6 @@
           <w:spacing w:val="-2"/>
           <w:w w:val="90"/>
           <w:sz w:val="18"/>
-          <w:highlight w:val="yellow"/>
         </w:rPr>
         <w:t>ROMÂNIA</w:t>
       </w:r>
@@ -3514,7 +3511,6 @@
           <w:color w:val="565656"/>
           <w:w w:val="90"/>
           <w:sz w:val="20"/>
-          <w:highlight w:val="yellow"/>
         </w:rPr>
         <w:t xml:space="preserve"> </w:t>
       </w:r>
@@ -3523,17 +3519,8 @@
           <w:color w:val="565656"/>
           <w:w w:val="90"/>
           <w:sz w:val="18"/>
-          <w:highlight w:val="yellow"/>
-        </w:rPr>
-        <w:t>–</w:t>
-      </w:r>
-      <w:r>
-        <w:rPr>
-          <w:color w:val="565656"/>
-          <w:w w:val="90"/>
-          <w:sz w:val="18"/>
-        </w:rPr>
-        <w:t xml:space="preserve"> </w:t>
+        </w:rPr>
+        <w:t xml:space="preserve">– </w:t>
       </w:r>
       <w:r>
         <w:rPr>
@@ -3571,7 +3558,7 @@
         <mc:AlternateContent>
           <mc:Choice Requires="wps">
             <w:drawing>
-              <wp:anchor distT="0" distB="0" distL="0" distR="0" simplePos="0" relativeHeight="487588352" behindDoc="1" locked="0" layoutInCell="1" allowOverlap="1" wp14:anchorId="7CEA5F00" wp14:editId="7CD6D173">
+              <wp:anchor distT="0" distB="0" distL="0" distR="0" simplePos="0" relativeHeight="251689984" behindDoc="1" locked="0" layoutInCell="1" allowOverlap="1" wp14:anchorId="7CEA5F00" wp14:editId="7CD6D173">
                 <wp:simplePos x="0" y="0"/>
                 <wp:positionH relativeFrom="page">
                   <wp:posOffset>360019</wp:posOffset>
@@ -3642,7 +3629,7 @@
           </mc:Choice>
           <mc:Fallback>
             <w:pict>
-              <v:shape w14:anchorId="4AA083AE" id="Graphic 12" o:spid="_x0000_s1026" style="position:absolute;margin-left:28.35pt;margin-top:10.15pt;width:276.4pt;height:.5pt;z-index:-15728128;visibility:visible;mso-wrap-style:square;mso-wrap-distance-left:0;mso-wrap-distance-top:0;mso-wrap-distance-right:0;mso-wrap-distance-bottom:0;mso-position-horizontal:absolute;mso-position-horizontal-relative:page;mso-position-vertical:absolute;mso-position-vertical-relative:text;v-text-anchor:top" coordsize="3510279,6350" o:gfxdata="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" path="m3510013,6350l,6350,,,3510013,r,6350xe" fillcolor="#5e3672" stroked="f">
+              <v:shape w14:anchorId="48D889DE" id="Graphic 12" o:spid="_x0000_s1026" style="position:absolute;margin-left:28.35pt;margin-top:10.15pt;width:276.4pt;height:.5pt;z-index:-251626496;visibility:visible;mso-wrap-style:square;mso-wrap-distance-left:0;mso-wrap-distance-top:0;mso-wrap-distance-right:0;mso-wrap-distance-bottom:0;mso-position-horizontal:absolute;mso-position-horizontal-relative:page;mso-position-vertical:absolute;mso-position-vertical-relative:text;v-text-anchor:top" coordsize="3510279,6350" o:gfxdata="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" path="m3510013,6350l,6350,,,3510013,r,6350xe" fillcolor="#5e3672" stroked="f">
                 <v:path arrowok="t"/>
                 <w10:wrap type="topAndBottom" anchorx="page"/>
               </v:shape>
@@ -5626,13 +5613,12 @@
         <w:rPr>
           <w:noProof/>
           <w:sz w:val="18"/>
-          <w:highlight w:val="yellow"/>
         </w:rPr>
         <w:drawing>
-          <wp:anchor distT="0" distB="0" distL="114300" distR="114300" simplePos="0" relativeHeight="251543552" behindDoc="0" locked="0" layoutInCell="1" allowOverlap="1" wp14:anchorId="58B31E2E" wp14:editId="02D8E374">
+          <wp:anchor distT="0" distB="0" distL="114300" distR="114300" simplePos="0" relativeHeight="251676672" behindDoc="0" locked="0" layoutInCell="1" allowOverlap="1" wp14:anchorId="58B31E2E" wp14:editId="660DAE0A">
             <wp:simplePos x="0" y="0"/>
             <wp:positionH relativeFrom="column">
-              <wp:posOffset>4360691</wp:posOffset>
+              <wp:posOffset>5000625</wp:posOffset>
             </wp:positionH>
             <wp:positionV relativeFrom="paragraph">
               <wp:posOffset>3175</wp:posOffset>
@@ -5689,7 +5675,6 @@
           <w:color w:val="565656"/>
           <w:w w:val="90"/>
           <w:sz w:val="18"/>
-          <w:highlight w:val="yellow"/>
         </w:rPr>
         <w:t>HELMOND,</w:t>
       </w:r>
@@ -5699,7 +5684,6 @@
           <w:spacing w:val="-1"/>
           <w:w w:val="90"/>
           <w:sz w:val="18"/>
-          <w:highlight w:val="yellow"/>
         </w:rPr>
         <w:t xml:space="preserve"> </w:t>
       </w:r>
@@ -5708,7 +5692,6 @@
           <w:color w:val="565656"/>
           <w:w w:val="90"/>
           <w:sz w:val="18"/>
-          <w:highlight w:val="yellow"/>
         </w:rPr>
         <w:t>OLANDA</w:t>
       </w:r>
@@ -5791,7 +5774,7 @@
         <mc:AlternateContent>
           <mc:Choice Requires="wps">
             <w:drawing>
-              <wp:anchor distT="0" distB="0" distL="0" distR="0" simplePos="0" relativeHeight="251454464" behindDoc="1" locked="0" layoutInCell="1" allowOverlap="1" wp14:anchorId="2697B511" wp14:editId="250A0D51">
+              <wp:anchor distT="0" distB="0" distL="0" distR="0" simplePos="0" relativeHeight="251633664" behindDoc="1" locked="0" layoutInCell="1" allowOverlap="1" wp14:anchorId="2697B511" wp14:editId="250A0D51">
                 <wp:simplePos x="0" y="0"/>
                 <wp:positionH relativeFrom="page">
                   <wp:posOffset>360019</wp:posOffset>
@@ -5862,7 +5845,7 @@
           </mc:Choice>
           <mc:Fallback>
             <w:pict>
-              <v:shape w14:anchorId="39424D8C" id="Graphic 19" o:spid="_x0000_s1026" style="position:absolute;margin-left:28.35pt;margin-top:10.2pt;width:276.4pt;height:.5pt;z-index:-251862016;visibility:visible;mso-wrap-style:square;mso-wrap-distance-left:0;mso-wrap-distance-top:0;mso-wrap-distance-right:0;mso-wrap-distance-bottom:0;mso-position-horizontal:absolute;mso-position-horizontal-relative:page;mso-position-vertical:absolute;mso-position-vertical-relative:text;v-text-anchor:top" coordsize="3510279,6350" o:gfxdata="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" path="m3510013,6350l,6350,,,3510013,r,6350xe" fillcolor="#5e3672" stroked="f">
+              <v:shape w14:anchorId="3A8B21F3" id="Graphic 19" o:spid="_x0000_s1026" style="position:absolute;margin-left:28.35pt;margin-top:10.2pt;width:276.4pt;height:.5pt;z-index:-251682816;visibility:visible;mso-wrap-style:square;mso-wrap-distance-left:0;mso-wrap-distance-top:0;mso-wrap-distance-right:0;mso-wrap-distance-bottom:0;mso-position-horizontal:absolute;mso-position-horizontal-relative:page;mso-position-vertical:absolute;mso-position-vertical-relative:text;v-text-anchor:top" coordsize="3510279,6350" o:gfxdata="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" path="m3510013,6350l,6350,,,3510013,r,6350xe" fillcolor="#5e3672" stroked="f">
                 <v:path arrowok="t"/>
                 <w10:wrap type="topAndBottom" anchorx="page"/>
               </v:shape>
@@ -7926,7 +7909,7 @@
           <w:w w:val="85"/>
         </w:rPr>
         <w:drawing>
-          <wp:anchor distT="0" distB="0" distL="114300" distR="114300" simplePos="0" relativeHeight="251821056" behindDoc="0" locked="0" layoutInCell="1" allowOverlap="1" wp14:anchorId="01194417" wp14:editId="613069BF">
+          <wp:anchor distT="0" distB="0" distL="114300" distR="114300" simplePos="0" relativeHeight="251688960" behindDoc="0" locked="0" layoutInCell="1" allowOverlap="1" wp14:anchorId="01194417" wp14:editId="613069BF">
             <wp:simplePos x="0" y="0"/>
             <wp:positionH relativeFrom="column">
               <wp:posOffset>6816725</wp:posOffset>
@@ -7989,7 +7972,7 @@
           <w:w w:val="85"/>
         </w:rPr>
         <w:drawing>
-          <wp:anchor distT="0" distB="0" distL="114300" distR="114300" simplePos="0" relativeHeight="251812864" behindDoc="0" locked="0" layoutInCell="1" allowOverlap="1" wp14:anchorId="5DA901C0" wp14:editId="535DFF2B">
+          <wp:anchor distT="0" distB="0" distL="114300" distR="114300" simplePos="0" relativeHeight="251687936" behindDoc="0" locked="0" layoutInCell="1" allowOverlap="1" wp14:anchorId="5DA901C0" wp14:editId="535DFF2B">
             <wp:simplePos x="0" y="0"/>
             <wp:positionH relativeFrom="column">
               <wp:posOffset>6078366</wp:posOffset>
@@ -8080,13 +8063,27 @@
           <w:sz w:val="18"/>
           <w:highlight w:val="yellow"/>
         </w:rPr>
-        <w:t xml:space="preserve"> HELMOND, OLANDA</w:t>
-      </w:r>
-      <w:r>
-        <w:rPr>
-          <w:sz w:val="18"/>
-        </w:rPr>
-        <w:t xml:space="preserve"> - </w:t>
+        <w:t xml:space="preserve"> </w:t>
+      </w:r>
+      <w:r>
+        <w:rPr>
+          <w:color w:val="565656"/>
+          <w:w w:val="90"/>
+          <w:sz w:val="18"/>
+        </w:rPr>
+        <w:t>HELMOND, OLANDA</w:t>
+      </w:r>
+      <w:r>
+        <w:rPr>
+          <w:sz w:val="18"/>
+        </w:rPr>
+        <w:t xml:space="preserve"> </w:t>
+      </w:r>
+      <w:r>
+        <w:rPr>
+          <w:sz w:val="18"/>
+        </w:rPr>
+        <w:t xml:space="preserve">- </w:t>
       </w:r>
       <w:r>
         <w:rPr>
@@ -8213,7 +8210,7 @@
         <mc:AlternateContent>
           <mc:Choice Requires="wps">
             <w:drawing>
-              <wp:anchor distT="0" distB="0" distL="0" distR="0" simplePos="0" relativeHeight="251462656" behindDoc="1" locked="0" layoutInCell="1" allowOverlap="1" wp14:anchorId="6AE7A921" wp14:editId="18BA4A23">
+              <wp:anchor distT="0" distB="0" distL="0" distR="0" simplePos="0" relativeHeight="251634688" behindDoc="1" locked="0" layoutInCell="1" allowOverlap="1" wp14:anchorId="6AE7A921" wp14:editId="18BA4A23">
                 <wp:simplePos x="0" y="0"/>
                 <wp:positionH relativeFrom="page">
                   <wp:posOffset>360019</wp:posOffset>
@@ -8284,7 +8281,7 @@
           </mc:Choice>
           <mc:Fallback>
             <w:pict>
-              <v:shape w14:anchorId="4DFF78D1" id="Graphic 26" o:spid="_x0000_s1026" style="position:absolute;margin-left:28.35pt;margin-top:10.65pt;width:276.4pt;height:.5pt;z-index:-251853824;visibility:visible;mso-wrap-style:square;mso-wrap-distance-left:0;mso-wrap-distance-top:0;mso-wrap-distance-right:0;mso-wrap-distance-bottom:0;mso-position-horizontal:absolute;mso-position-horizontal-relative:page;mso-position-vertical:absolute;mso-position-vertical-relative:text;v-text-anchor:top" coordsize="3510279,6350" o:gfxdata="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" path="m3510013,6350l,6350,,,3510013,r,6350xe" fillcolor="#5e3672" stroked="f">
+              <v:shape w14:anchorId="042E8DAE" id="Graphic 26" o:spid="_x0000_s1026" style="position:absolute;margin-left:28.35pt;margin-top:10.65pt;width:276.4pt;height:.5pt;z-index:-251681792;visibility:visible;mso-wrap-style:square;mso-wrap-distance-left:0;mso-wrap-distance-top:0;mso-wrap-distance-right:0;mso-wrap-distance-bottom:0;mso-position-horizontal:absolute;mso-position-horizontal-relative:page;mso-position-vertical:absolute;mso-position-vertical-relative:text;v-text-anchor:top" coordsize="3510279,6350" o:gfxdata="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" path="m3510013,6350l,6350,,,3510013,r,6350xe" fillcolor="#5e3672" stroked="f">
                 <v:path arrowok="t"/>
                 <w10:wrap type="topAndBottom" anchorx="page"/>
               </v:shape>
@@ -8883,16 +8880,16 @@
           <w:sz w:val="18"/>
         </w:rPr>
         <w:drawing>
-          <wp:anchor distT="0" distB="0" distL="114300" distR="114300" simplePos="0" relativeHeight="251559936" behindDoc="0" locked="0" layoutInCell="1" allowOverlap="1" wp14:anchorId="3D5E197B" wp14:editId="0F19A89C">
+          <wp:anchor distT="0" distB="0" distL="114300" distR="114300" simplePos="0" relativeHeight="251680768" behindDoc="0" locked="0" layoutInCell="1" allowOverlap="1" wp14:anchorId="3D5E197B" wp14:editId="34F35843">
             <wp:simplePos x="0" y="0"/>
             <wp:positionH relativeFrom="column">
-              <wp:posOffset>4648102</wp:posOffset>
+              <wp:posOffset>4960620</wp:posOffset>
             </wp:positionH>
             <wp:positionV relativeFrom="paragraph">
-              <wp:posOffset>15875</wp:posOffset>
+              <wp:posOffset>165100</wp:posOffset>
             </wp:positionV>
-            <wp:extent cx="973905" cy="416169"/>
-            <wp:effectExtent l="0" t="0" r="0" b="3175"/>
+            <wp:extent cx="708660" cy="302260"/>
+            <wp:effectExtent l="0" t="0" r="0" b="2540"/>
             <wp:wrapNone/>
             <wp:docPr id="56" name="Picture 56"/>
             <wp:cNvGraphicFramePr>
@@ -8920,7 +8917,7 @@
                   <pic:spPr>
                     <a:xfrm>
                       <a:off x="0" y="0"/>
-                      <a:ext cx="973905" cy="416169"/>
+                      <a:ext cx="708660" cy="302260"/>
                     </a:xfrm>
                     <a:prstGeom prst="rect">
                       <a:avLst/>
@@ -9121,7 +9118,6 @@
           <w:color w:val="565656"/>
           <w:w w:val="90"/>
           <w:sz w:val="18"/>
-          <w:highlight w:val="yellow"/>
         </w:rPr>
         <w:t>LIPOVA,</w:t>
       </w:r>
@@ -9131,7 +9127,6 @@
           <w:spacing w:val="-5"/>
           <w:w w:val="90"/>
           <w:sz w:val="18"/>
-          <w:highlight w:val="yellow"/>
         </w:rPr>
         <w:t xml:space="preserve"> </w:t>
       </w:r>
@@ -9141,7 +9136,6 @@
           <w:spacing w:val="-2"/>
           <w:w w:val="90"/>
           <w:sz w:val="18"/>
-          <w:highlight w:val="yellow"/>
         </w:rPr>
         <w:t>ROMÂNIA</w:t>
       </w:r>
@@ -9151,7 +9145,6 @@
           <w:color w:val="565656"/>
           <w:w w:val="90"/>
           <w:sz w:val="20"/>
-          <w:highlight w:val="yellow"/>
         </w:rPr>
         <w:t xml:space="preserve"> </w:t>
       </w:r>
@@ -9161,7 +9154,6 @@
           <w:color w:val="565656"/>
           <w:w w:val="90"/>
           <w:sz w:val="20"/>
-          <w:highlight w:val="yellow"/>
         </w:rPr>
         <w:t xml:space="preserve"> </w:t>
       </w:r>
@@ -9170,7 +9162,6 @@
           <w:color w:val="565656"/>
           <w:w w:val="90"/>
           <w:sz w:val="18"/>
-          <w:highlight w:val="yellow"/>
         </w:rPr>
         <w:t>–</w:t>
       </w:r>
@@ -9351,7 +9342,7 @@
           </mc:Choice>
           <mc:Fallback>
             <w:pict>
-              <v:group w14:anchorId="3E0D7A3D" id="Group 27" o:spid="_x0000_s1026" style="width:276.4pt;height:.5pt;mso-position-horizontal-relative:char;mso-position-vertical-relative:line" coordsize="35102,63" o:gfxdata="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">
+              <v:group w14:anchorId="0F7821CC" id="Group 27" o:spid="_x0000_s1026" style="width:276.4pt;height:.5pt;mso-position-horizontal-relative:char;mso-position-vertical-relative:line" coordsize="35102,63" o:gfxdata="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">
                 <v:shape id="Graphic 28" o:spid="_x0000_s1027" style="position:absolute;width:35102;height:63;visibility:visible;mso-wrap-style:square;v-text-anchor:top" coordsize="3510279,6350" o:gfxdata="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" path="m3510013,6349l,6349,,,3510013,r,6349xe" fillcolor="#5e3672" stroked="f">
                   <v:path arrowok="t"/>
                 </v:shape>
@@ -9882,7 +9873,6 @@
           <w:color w:val="565656"/>
           <w:w w:val="85"/>
           <w:sz w:val="18"/>
-          <w:highlight w:val="yellow"/>
         </w:rPr>
         <w:t>ARAD,</w:t>
       </w:r>
@@ -9891,7 +9881,6 @@
           <w:color w:val="565656"/>
           <w:spacing w:val="-3"/>
           <w:sz w:val="18"/>
-          <w:highlight w:val="yellow"/>
         </w:rPr>
         <w:t xml:space="preserve"> </w:t>
       </w:r>
@@ -9901,7 +9890,6 @@
           <w:spacing w:val="-2"/>
           <w:w w:val="85"/>
           <w:sz w:val="18"/>
-          <w:highlight w:val="yellow"/>
         </w:rPr>
         <w:t>ROMÂNIA</w:t>
       </w:r>
@@ -9911,7 +9899,6 @@
           <w:color w:val="565656"/>
           <w:w w:val="85"/>
           <w:sz w:val="20"/>
-          <w:highlight w:val="yellow"/>
         </w:rPr>
         <w:t xml:space="preserve"> </w:t>
       </w:r>
@@ -9920,17 +9907,8 @@
           <w:color w:val="565656"/>
           <w:w w:val="85"/>
           <w:sz w:val="18"/>
-          <w:highlight w:val="yellow"/>
-        </w:rPr>
-        <w:t>–</w:t>
-      </w:r>
-      <w:r>
-        <w:rPr>
-          <w:color w:val="565656"/>
-          <w:w w:val="85"/>
-          <w:sz w:val="18"/>
-        </w:rPr>
-        <w:t xml:space="preserve"> </w:t>
+        </w:rPr>
+        <w:t xml:space="preserve">– </w:t>
       </w:r>
       <w:r>
         <w:rPr>
@@ -10021,7 +9999,7 @@
         <mc:AlternateContent>
           <mc:Choice Requires="wps">
             <w:drawing>
-              <wp:anchor distT="0" distB="0" distL="0" distR="0" simplePos="0" relativeHeight="251467776" behindDoc="1" locked="0" layoutInCell="1" allowOverlap="1" wp14:anchorId="13EACA91" wp14:editId="2411338C">
+              <wp:anchor distT="0" distB="0" distL="0" distR="0" simplePos="0" relativeHeight="251635712" behindDoc="1" locked="0" layoutInCell="1" allowOverlap="1" wp14:anchorId="13EACA91" wp14:editId="2411338C">
                 <wp:simplePos x="0" y="0"/>
                 <wp:positionH relativeFrom="page">
                   <wp:posOffset>360019</wp:posOffset>
@@ -10092,7 +10070,7 @@
           </mc:Choice>
           <mc:Fallback>
             <w:pict>
-              <v:shape w14:anchorId="21D49ED2" id="Graphic 30" o:spid="_x0000_s1026" style="position:absolute;margin-left:28.35pt;margin-top:10.15pt;width:276.4pt;height:.5pt;z-index:-251848704;visibility:visible;mso-wrap-style:square;mso-wrap-distance-left:0;mso-wrap-distance-top:0;mso-wrap-distance-right:0;mso-wrap-distance-bottom:0;mso-position-horizontal:absolute;mso-position-horizontal-relative:page;mso-position-vertical:absolute;mso-position-vertical-relative:text;v-text-anchor:top" coordsize="3510279,6350" o:gfxdata="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" path="m3510013,6349l,6349,,,3510013,r,6349xe" fillcolor="#5e3672" stroked="f">
+              <v:shape w14:anchorId="465159CF" id="Graphic 30" o:spid="_x0000_s1026" style="position:absolute;margin-left:28.35pt;margin-top:10.15pt;width:276.4pt;height:.5pt;z-index:-251680768;visibility:visible;mso-wrap-style:square;mso-wrap-distance-left:0;mso-wrap-distance-top:0;mso-wrap-distance-right:0;mso-wrap-distance-bottom:0;mso-position-horizontal:absolute;mso-position-horizontal-relative:page;mso-position-vertical:absolute;mso-position-vertical-relative:text;v-text-anchor:top" coordsize="3510279,6350" o:gfxdata="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" path="m3510013,6349l,6349,,,3510013,r,6349xe" fillcolor="#5e3672" stroked="f">
                 <v:path arrowok="t"/>
                 <w10:wrap type="topAndBottom" anchorx="page"/>
               </v:shape>
@@ -10382,22 +10360,33 @@
         <w:pStyle w:val="BodyText"/>
         <w:spacing w:before="2"/>
       </w:pPr>
+    </w:p>
+    <w:p>
+      <w:pPr>
+        <w:spacing w:before="1"/>
+        <w:ind w:left="566"/>
+        <w:rPr>
+          <w:sz w:val="18"/>
+        </w:rPr>
+      </w:pPr>
+      <w:bookmarkStart w:id="12" w:name="OPERATOR________________________________"/>
+      <w:bookmarkEnd w:id="12"/>
       <w:r>
         <w:rPr>
           <w:noProof/>
           <w:sz w:val="18"/>
         </w:rPr>
         <w:drawing>
-          <wp:anchor distT="0" distB="0" distL="114300" distR="114300" simplePos="0" relativeHeight="251567104" behindDoc="0" locked="0" layoutInCell="1" allowOverlap="1" wp14:anchorId="1BC4D76F" wp14:editId="3352EE51">
+          <wp:anchor distT="0" distB="0" distL="114300" distR="114300" simplePos="0" relativeHeight="251682816" behindDoc="0" locked="0" layoutInCell="1" allowOverlap="1" wp14:anchorId="1BC4D76F" wp14:editId="022AB97C">
             <wp:simplePos x="0" y="0"/>
             <wp:positionH relativeFrom="column">
-              <wp:posOffset>4442850</wp:posOffset>
+              <wp:posOffset>4892040</wp:posOffset>
             </wp:positionH>
             <wp:positionV relativeFrom="paragraph">
-              <wp:posOffset>110294</wp:posOffset>
+              <wp:posOffset>7620</wp:posOffset>
             </wp:positionV>
-            <wp:extent cx="826477" cy="413239"/>
-            <wp:effectExtent l="0" t="0" r="0" b="6350"/>
+            <wp:extent cx="822960" cy="411480"/>
+            <wp:effectExtent l="0" t="0" r="0" b="7620"/>
             <wp:wrapNone/>
             <wp:docPr id="58" name="Picture 58"/>
             <wp:cNvGraphicFramePr>
@@ -10425,7 +10414,7 @@
                   <pic:spPr>
                     <a:xfrm>
                       <a:off x="0" y="0"/>
-                      <a:ext cx="826477" cy="413239"/>
+                      <a:ext cx="822960" cy="411480"/>
                     </a:xfrm>
                     <a:prstGeom prst="rect">
                       <a:avLst/>
@@ -10443,17 +10432,6 @@
           </wp:anchor>
         </w:drawing>
       </w:r>
-    </w:p>
-    <w:p>
-      <w:pPr>
-        <w:spacing w:before="1"/>
-        <w:ind w:left="566"/>
-        <w:rPr>
-          <w:sz w:val="18"/>
-        </w:rPr>
-      </w:pPr>
-      <w:bookmarkStart w:id="12" w:name="OPERATOR________________________________"/>
-      <w:bookmarkEnd w:id="12"/>
       <w:r>
         <w:rPr>
           <w:b/>
@@ -10619,7 +10597,6 @@
           <w:color w:val="565656"/>
           <w:w w:val="85"/>
           <w:sz w:val="18"/>
-          <w:highlight w:val="yellow"/>
         </w:rPr>
         <w:t>ZATEC,</w:t>
       </w:r>
@@ -10628,7 +10605,6 @@
           <w:color w:val="565656"/>
           <w:spacing w:val="3"/>
           <w:sz w:val="18"/>
-          <w:highlight w:val="yellow"/>
         </w:rPr>
         <w:t xml:space="preserve"> </w:t>
       </w:r>
@@ -10638,7 +10614,6 @@
           <w:spacing w:val="-2"/>
           <w:w w:val="85"/>
           <w:sz w:val="18"/>
-          <w:highlight w:val="yellow"/>
         </w:rPr>
         <w:t xml:space="preserve">CEHIA </w:t>
       </w:r>
@@ -10647,7 +10622,6 @@
           <w:color w:val="565656"/>
           <w:w w:val="85"/>
           <w:sz w:val="18"/>
-          <w:highlight w:val="yellow"/>
         </w:rPr>
         <w:t>–</w:t>
       </w:r>
@@ -10827,7 +10801,7 @@
           </mc:Choice>
           <mc:Fallback>
             <w:pict>
-              <v:shape w14:anchorId="3FE82C70" id="Graphic 31" o:spid="_x0000_s1026" style="position:absolute;margin-left:28.35pt;margin-top:10.15pt;width:276.4pt;height:.5pt;z-index:-251843584;visibility:visible;mso-wrap-style:square;mso-wrap-distance-left:0;mso-wrap-distance-top:0;mso-wrap-distance-right:0;mso-wrap-distance-bottom:0;mso-position-horizontal:absolute;mso-position-horizontal-relative:page;mso-position-vertical:absolute;mso-position-vertical-relative:text;v-text-anchor:top" coordsize="3510279,6350" o:gfxdata="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" path="m3510013,6350l,6350,,,3510013,r,6350xe" fillcolor="#5e3672" stroked="f">
+              <v:shape w14:anchorId="68EE6A3C" id="Graphic 31" o:spid="_x0000_s1026" style="position:absolute;margin-left:28.35pt;margin-top:10.15pt;width:276.4pt;height:.5pt;z-index:-251843584;visibility:visible;mso-wrap-style:square;mso-wrap-distance-left:0;mso-wrap-distance-top:0;mso-wrap-distance-right:0;mso-wrap-distance-bottom:0;mso-position-horizontal:absolute;mso-position-horizontal-relative:page;mso-position-vertical:absolute;mso-position-vertical-relative:text;v-text-anchor:top" coordsize="3510279,6350" o:gfxdata="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" path="m3510013,6350l,6350,,,3510013,r,6350xe" fillcolor="#5e3672" stroked="f">
                 <v:path arrowok="t"/>
                 <w10:wrap type="topAndBottom" anchorx="page"/>
               </v:shape>
@@ -11239,16 +11213,16 @@
           <w:sz w:val="11"/>
         </w:rPr>
         <w:drawing>
-          <wp:anchor distT="0" distB="0" distL="114300" distR="114300" simplePos="0" relativeHeight="251579392" behindDoc="0" locked="0" layoutInCell="1" allowOverlap="1" wp14:anchorId="04ADCA8E" wp14:editId="59700093">
+          <wp:anchor distT="0" distB="0" distL="114300" distR="114300" simplePos="0" relativeHeight="251579392" behindDoc="0" locked="0" layoutInCell="1" allowOverlap="1" wp14:anchorId="04ADCA8E" wp14:editId="78197671">
             <wp:simplePos x="0" y="0"/>
             <wp:positionH relativeFrom="column">
-              <wp:posOffset>4841369</wp:posOffset>
+              <wp:posOffset>5052060</wp:posOffset>
             </wp:positionH>
             <wp:positionV relativeFrom="paragraph">
-              <wp:posOffset>44597</wp:posOffset>
+              <wp:posOffset>187325</wp:posOffset>
             </wp:positionV>
-            <wp:extent cx="691661" cy="461193"/>
-            <wp:effectExtent l="0" t="0" r="0" b="0"/>
+            <wp:extent cx="533400" cy="355666"/>
+            <wp:effectExtent l="0" t="0" r="0" b="6350"/>
             <wp:wrapNone/>
             <wp:docPr id="64" name="Picture 64"/>
             <wp:cNvGraphicFramePr>
@@ -11276,7 +11250,7 @@
                   <pic:spPr>
                     <a:xfrm>
                       <a:off x="0" y="0"/>
-                      <a:ext cx="691661" cy="461193"/>
+                      <a:ext cx="533400" cy="355666"/>
                     </a:xfrm>
                     <a:prstGeom prst="rect">
                       <a:avLst/>
@@ -11459,7 +11433,6 @@
           <w:color w:val="565656"/>
           <w:w w:val="85"/>
           <w:sz w:val="18"/>
-          <w:highlight w:val="yellow"/>
         </w:rPr>
         <w:t>LIPOVA,</w:t>
       </w:r>
@@ -11468,7 +11441,6 @@
           <w:color w:val="565656"/>
           <w:spacing w:val="2"/>
           <w:sz w:val="18"/>
-          <w:highlight w:val="yellow"/>
         </w:rPr>
         <w:t xml:space="preserve"> </w:t>
       </w:r>
@@ -11478,7 +11450,6 @@
           <w:spacing w:val="-2"/>
           <w:w w:val="85"/>
           <w:sz w:val="18"/>
-          <w:highlight w:val="yellow"/>
         </w:rPr>
         <w:t>ROMÂNIA</w:t>
       </w:r>
@@ -11488,7 +11459,6 @@
           <w:color w:val="565656"/>
           <w:w w:val="85"/>
           <w:sz w:val="20"/>
-          <w:highlight w:val="yellow"/>
         </w:rPr>
         <w:t xml:space="preserve"> </w:t>
       </w:r>
@@ -11497,7 +11467,6 @@
           <w:color w:val="F79646" w:themeColor="accent6"/>
           <w:w w:val="85"/>
           <w:sz w:val="18"/>
-          <w:highlight w:val="yellow"/>
         </w:rPr>
         <w:t>–</w:t>
       </w:r>
@@ -11669,7 +11638,7 @@
           </mc:Choice>
           <mc:Fallback>
             <w:pict>
-              <v:shape w14:anchorId="240F0425" id="Graphic 33" o:spid="_x0000_s1026" style="position:absolute;margin-left:28.35pt;margin-top:10.15pt;width:276.4pt;height:.5pt;z-index:-251493376;visibility:visible;mso-wrap-style:square;mso-wrap-distance-left:0;mso-wrap-distance-top:0;mso-wrap-distance-right:0;mso-wrap-distance-bottom:0;mso-position-horizontal:absolute;mso-position-horizontal-relative:page;mso-position-vertical:absolute;mso-position-vertical-relative:text;v-text-anchor:top" coordsize="3510279,6350" o:gfxdata="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" path="m3510013,6350l,6350,,,3510013,r,6350xe" fillcolor="#5e3672" stroked="f">
+              <v:shape w14:anchorId="0DAA9AE3" id="Graphic 33" o:spid="_x0000_s1026" style="position:absolute;margin-left:28.35pt;margin-top:10.15pt;width:276.4pt;height:.5pt;z-index:-251493376;visibility:visible;mso-wrap-style:square;mso-wrap-distance-left:0;mso-wrap-distance-top:0;mso-wrap-distance-right:0;mso-wrap-distance-bottom:0;mso-position-horizontal:absolute;mso-position-horizontal-relative:page;mso-position-vertical:absolute;mso-position-vertical-relative:text;v-text-anchor:top" coordsize="3510279,6350" o:gfxdata="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" path="m3510013,6350l,6350,,,3510013,r,6350xe" fillcolor="#5e3672" stroked="f">
                 <v:path arrowok="t"/>
                 <w10:wrap type="topAndBottom" anchorx="page"/>
               </v:shape>
@@ -12544,7 +12513,6 @@
           <w:color w:val="565656"/>
           <w:w w:val="85"/>
           <w:sz w:val="18"/>
-          <w:highlight w:val="yellow"/>
         </w:rPr>
         <w:t>NORNESS,</w:t>
       </w:r>
@@ -12553,7 +12521,6 @@
           <w:color w:val="565656"/>
           <w:spacing w:val="7"/>
           <w:sz w:val="18"/>
-          <w:highlight w:val="yellow"/>
         </w:rPr>
         <w:t xml:space="preserve"> </w:t>
       </w:r>
@@ -12563,7 +12530,6 @@
           <w:spacing w:val="-2"/>
           <w:w w:val="85"/>
           <w:sz w:val="18"/>
-          <w:highlight w:val="yellow"/>
         </w:rPr>
         <w:t>NORVEGIA</w:t>
       </w:r>
@@ -12754,7 +12720,7 @@
           </mc:Choice>
           <mc:Fallback>
             <w:pict>
-              <v:shape w14:anchorId="0C5B5748" id="Graphic 29" o:spid="_x0000_s1026" style="position:absolute;margin-left:28.35pt;margin-top:10.2pt;width:276.4pt;height:.5pt;z-index:-251479040;visibility:visible;mso-wrap-style:square;mso-wrap-distance-left:0;mso-wrap-distance-top:0;mso-wrap-distance-right:0;mso-wrap-distance-bottom:0;mso-position-horizontal:absolute;mso-position-horizontal-relative:page;mso-position-vertical:absolute;mso-position-vertical-relative:text;v-text-anchor:top" coordsize="3510279,6350" o:gfxdata="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" path="m3510013,6350l,6350,,,3510013,r,6350xe" fillcolor="#5e3672" stroked="f">
+              <v:shape w14:anchorId="19C7238D" id="Graphic 29" o:spid="_x0000_s1026" style="position:absolute;margin-left:28.35pt;margin-top:10.2pt;width:276.4pt;height:.5pt;z-index:-251479040;visibility:visible;mso-wrap-style:square;mso-wrap-distance-left:0;mso-wrap-distance-top:0;mso-wrap-distance-right:0;mso-wrap-distance-bottom:0;mso-position-horizontal:absolute;mso-position-horizontal-relative:page;mso-position-vertical:absolute;mso-position-vertical-relative:text;v-text-anchor:top" coordsize="3510279,6350" o:gfxdata="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" path="m3510013,6350l,6350,,,3510013,r,6350xe" fillcolor="#5e3672" stroked="f">
                 <v:path arrowok="t"/>
                 <w10:wrap type="topAndBottom" anchorx="page"/>
               </v:shape>
@@ -13095,7 +13061,6 @@
           <w:color w:val="565656"/>
           <w:w w:val="85"/>
           <w:sz w:val="18"/>
-          <w:highlight w:val="yellow"/>
         </w:rPr>
         <w:t>LIPOVA,</w:t>
       </w:r>
@@ -13104,7 +13069,6 @@
           <w:color w:val="565656"/>
           <w:spacing w:val="-1"/>
           <w:sz w:val="18"/>
-          <w:highlight w:val="yellow"/>
         </w:rPr>
         <w:t xml:space="preserve"> </w:t>
       </w:r>
@@ -13114,7 +13078,6 @@
           <w:spacing w:val="-2"/>
           <w:w w:val="85"/>
           <w:sz w:val="18"/>
-          <w:highlight w:val="yellow"/>
         </w:rPr>
         <w:t>ROMÂNIA</w:t>
       </w:r>
@@ -13124,7 +13087,6 @@
           <w:color w:val="565656"/>
           <w:w w:val="85"/>
           <w:sz w:val="20"/>
-          <w:highlight w:val="yellow"/>
         </w:rPr>
         <w:t xml:space="preserve"> </w:t>
       </w:r>
@@ -13133,7 +13095,6 @@
           <w:color w:val="565656"/>
           <w:w w:val="85"/>
           <w:sz w:val="18"/>
-          <w:highlight w:val="yellow"/>
         </w:rPr>
         <w:t>–</w:t>
       </w:r>
@@ -13323,7 +13284,7 @@
           </mc:Choice>
           <mc:Fallback>
             <w:pict>
-              <v:shape w14:anchorId="0B0A3939" id="Graphic 35" o:spid="_x0000_s1026" style="position:absolute;margin-left:28.35pt;margin-top:10.15pt;width:276.4pt;height:.5pt;z-index:-251491328;visibility:visible;mso-wrap-style:square;mso-wrap-distance-left:0;mso-wrap-distance-top:0;mso-wrap-distance-right:0;mso-wrap-distance-bottom:0;mso-position-horizontal:absolute;mso-position-horizontal-relative:page;mso-position-vertical:absolute;mso-position-vertical-relative:text;v-text-anchor:top" coordsize="3510279,6350" o:gfxdata="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" path="m3510013,6350l,6350,,,3510013,r,6350xe" fillcolor="#5e3672" stroked="f">
+              <v:shape w14:anchorId="4A378D3A" id="Graphic 35" o:spid="_x0000_s1026" style="position:absolute;margin-left:28.35pt;margin-top:10.15pt;width:276.4pt;height:.5pt;z-index:-251491328;visibility:visible;mso-wrap-style:square;mso-wrap-distance-left:0;mso-wrap-distance-top:0;mso-wrap-distance-right:0;mso-wrap-distance-bottom:0;mso-position-horizontal:absolute;mso-position-horizontal-relative:page;mso-position-vertical:absolute;mso-position-vertical-relative:text;v-text-anchor:top" coordsize="3510279,6350" o:gfxdata="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" path="m3510013,6350l,6350,,,3510013,r,6350xe" fillcolor="#5e3672" stroked="f">
                 <v:path arrowok="t"/>
                 <w10:wrap type="topAndBottom" anchorx="page"/>
               </v:shape>
@@ -13424,15 +13385,15 @@
           <w:sz w:val="18"/>
         </w:rPr>
         <w:drawing>
-          <wp:anchor distT="0" distB="0" distL="114300" distR="114300" simplePos="0" relativeHeight="251587584" behindDoc="0" locked="0" layoutInCell="1" allowOverlap="1" wp14:anchorId="76AD859B" wp14:editId="64A8DC2F">
+          <wp:anchor distT="0" distB="0" distL="114300" distR="114300" simplePos="0" relativeHeight="251587584" behindDoc="0" locked="0" layoutInCell="1" allowOverlap="1" wp14:anchorId="76AD859B" wp14:editId="49409B39">
             <wp:simplePos x="0" y="0"/>
             <wp:positionH relativeFrom="column">
-              <wp:posOffset>4507376</wp:posOffset>
+              <wp:posOffset>4076700</wp:posOffset>
             </wp:positionH>
             <wp:positionV relativeFrom="paragraph">
-              <wp:posOffset>15094</wp:posOffset>
+              <wp:posOffset>128905</wp:posOffset>
             </wp:positionV>
-            <wp:extent cx="445476" cy="445476"/>
+            <wp:extent cx="327660" cy="327660"/>
             <wp:effectExtent l="0" t="0" r="0" b="0"/>
             <wp:wrapNone/>
             <wp:docPr id="65" name="Picture 65"/>
@@ -13461,7 +13422,7 @@
                   <pic:spPr>
                     <a:xfrm>
                       <a:off x="0" y="0"/>
-                      <a:ext cx="445476" cy="445476"/>
+                      <a:ext cx="327660" cy="327660"/>
                     </a:xfrm>
                     <a:prstGeom prst="rect">
                       <a:avLst/>
@@ -13641,7 +13602,6 @@
           <w:color w:val="565656"/>
           <w:w w:val="85"/>
           <w:sz w:val="18"/>
-          <w:highlight w:val="yellow"/>
         </w:rPr>
         <w:t>LIPOVA,</w:t>
       </w:r>
@@ -13649,7 +13609,6 @@
         <w:rPr>
           <w:color w:val="565656"/>
           <w:sz w:val="18"/>
-          <w:highlight w:val="yellow"/>
         </w:rPr>
         <w:t xml:space="preserve"> </w:t>
       </w:r>
@@ -13659,7 +13618,6 @@
           <w:spacing w:val="-2"/>
           <w:w w:val="85"/>
           <w:sz w:val="18"/>
-          <w:highlight w:val="yellow"/>
         </w:rPr>
         <w:t>ROMÂNIA</w:t>
       </w:r>
@@ -13848,7 +13806,7 @@
           </mc:Choice>
           <mc:Fallback>
             <w:pict>
-              <v:shape w14:anchorId="739179A3" id="Graphic 36" o:spid="_x0000_s1026" style="position:absolute;margin-left:28.35pt;margin-top:10.15pt;width:276.4pt;height:.5pt;z-index:-251489280;visibility:visible;mso-wrap-style:square;mso-wrap-distance-left:0;mso-wrap-distance-top:0;mso-wrap-distance-right:0;mso-wrap-distance-bottom:0;mso-position-horizontal:absolute;mso-position-horizontal-relative:page;mso-position-vertical:absolute;mso-position-vertical-relative:text;v-text-anchor:top" coordsize="3510279,6350" o:gfxdata="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" path="m3510013,6350l,6350,,,3510013,r,6350xe" fillcolor="#5e3672" stroked="f">
+              <v:shape w14:anchorId="31942990" id="Graphic 36" o:spid="_x0000_s1026" style="position:absolute;margin-left:28.35pt;margin-top:10.15pt;width:276.4pt;height:.5pt;z-index:-251489280;visibility:visible;mso-wrap-style:square;mso-wrap-distance-left:0;mso-wrap-distance-top:0;mso-wrap-distance-right:0;mso-wrap-distance-bottom:0;mso-position-horizontal:absolute;mso-position-horizontal-relative:page;mso-position-vertical:absolute;mso-position-vertical-relative:text;v-text-anchor:top" coordsize="3510279,6350" o:gfxdata="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" path="m3510013,6350l,6350,,,3510013,r,6350xe" fillcolor="#5e3672" stroked="f">
                 <v:path arrowok="t"/>
                 <w10:wrap type="topAndBottom" anchorx="page"/>
               </v:shape>
@@ -14538,7 +14496,6 @@
           <w:color w:val="565656"/>
           <w:w w:val="85"/>
           <w:sz w:val="18"/>
-          <w:highlight w:val="yellow"/>
         </w:rPr>
         <w:t>SONTHOFEN,</w:t>
       </w:r>
@@ -14547,7 +14504,6 @@
           <w:color w:val="565656"/>
           <w:spacing w:val="5"/>
           <w:sz w:val="18"/>
-          <w:highlight w:val="yellow"/>
         </w:rPr>
         <w:t xml:space="preserve"> </w:t>
       </w:r>
@@ -14557,7 +14513,6 @@
           <w:spacing w:val="-2"/>
           <w:w w:val="85"/>
           <w:sz w:val="18"/>
-          <w:highlight w:val="yellow"/>
         </w:rPr>
         <w:t>GERMANIA</w:t>
       </w:r>
@@ -14567,7 +14522,6 @@
           <w:spacing w:val="-2"/>
           <w:w w:val="85"/>
           <w:sz w:val="18"/>
-          <w:highlight w:val="yellow"/>
         </w:rPr>
         <w:t xml:space="preserve"> </w:t>
       </w:r>
@@ -14576,7 +14530,6 @@
           <w:color w:val="F79646" w:themeColor="accent6"/>
           <w:w w:val="85"/>
           <w:sz w:val="18"/>
-          <w:highlight w:val="yellow"/>
         </w:rPr>
         <w:t>–</w:t>
       </w:r>
@@ -14821,7 +14774,7 @@
           </mc:Choice>
           <mc:Fallback>
             <w:pict>
-              <v:shape w14:anchorId="3EAA9908" id="Graphic 37" o:spid="_x0000_s1026" style="position:absolute;margin-left:28.35pt;margin-top:10.2pt;width:276.4pt;height:.5pt;z-index:-251487232;visibility:visible;mso-wrap-style:square;mso-wrap-distance-left:0;mso-wrap-distance-top:0;mso-wrap-distance-right:0;mso-wrap-distance-bottom:0;mso-position-horizontal:absolute;mso-position-horizontal-relative:page;mso-position-vertical:absolute;mso-position-vertical-relative:text;v-text-anchor:top" coordsize="3510279,6350" o:gfxdata="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" path="m3510013,6350l,6350,,,3510013,r,6350xe" fillcolor="#5e3672" stroked="f">
+              <v:shape w14:anchorId="37D43716" id="Graphic 37" o:spid="_x0000_s1026" style="position:absolute;margin-left:28.35pt;margin-top:10.2pt;width:276.4pt;height:.5pt;z-index:-251487232;visibility:visible;mso-wrap-style:square;mso-wrap-distance-left:0;mso-wrap-distance-top:0;mso-wrap-distance-right:0;mso-wrap-distance-bottom:0;mso-position-horizontal:absolute;mso-position-horizontal-relative:page;mso-position-vertical:absolute;mso-position-vertical-relative:text;v-text-anchor:top" coordsize="3510279,6350" o:gfxdata="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" path="m3510013,6350l,6350,,,3510013,r,6350xe" fillcolor="#5e3672" stroked="f">
                 <v:path arrowok="t"/>
                 <w10:wrap type="topAndBottom" anchorx="page"/>
               </v:shape>
@@ -15261,7 +15214,6 @@
           <w:color w:val="565656"/>
           <w:w w:val="85"/>
           <w:sz w:val="18"/>
-          <w:highlight w:val="yellow"/>
         </w:rPr>
         <w:t>HUNEDOARA,</w:t>
       </w:r>
@@ -15270,7 +15222,6 @@
           <w:color w:val="565656"/>
           <w:spacing w:val="6"/>
           <w:sz w:val="18"/>
-          <w:highlight w:val="yellow"/>
         </w:rPr>
         <w:t xml:space="preserve"> </w:t>
       </w:r>
@@ -15280,7 +15231,6 @@
           <w:spacing w:val="-2"/>
           <w:w w:val="85"/>
           <w:sz w:val="18"/>
-          <w:highlight w:val="yellow"/>
         </w:rPr>
         <w:t xml:space="preserve">ROMÂNIA </w:t>
       </w:r>
@@ -15289,7 +15239,6 @@
           <w:color w:val="565656"/>
           <w:w w:val="85"/>
           <w:sz w:val="18"/>
-          <w:highlight w:val="yellow"/>
         </w:rPr>
         <w:t>–</w:t>
       </w:r>
@@ -15506,7 +15455,7 @@
           </mc:Choice>
           <mc:Fallback>
             <w:pict>
-              <v:shape w14:anchorId="432BC018" id="Graphic 38" o:spid="_x0000_s1026" style="position:absolute;margin-left:28.35pt;margin-top:10.15pt;width:276.4pt;height:.5pt;z-index:-251485184;visibility:visible;mso-wrap-style:square;mso-wrap-distance-left:0;mso-wrap-distance-top:0;mso-wrap-distance-right:0;mso-wrap-distance-bottom:0;mso-position-horizontal:absolute;mso-position-horizontal-relative:page;mso-position-vertical:absolute;mso-position-vertical-relative:text;v-text-anchor:top" coordsize="3510279,6350" o:gfxdata="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" path="m3510013,6350l,6350,,,3510013,r,6350xe" fillcolor="#5e3672" stroked="f">
+              <v:shape w14:anchorId="3CCDF462" id="Graphic 38" o:spid="_x0000_s1026" style="position:absolute;margin-left:28.35pt;margin-top:10.15pt;width:276.4pt;height:.5pt;z-index:-251485184;visibility:visible;mso-wrap-style:square;mso-wrap-distance-left:0;mso-wrap-distance-top:0;mso-wrap-distance-right:0;mso-wrap-distance-bottom:0;mso-position-horizontal:absolute;mso-position-horizontal-relative:page;mso-position-vertical:absolute;mso-position-vertical-relative:text;v-text-anchor:top" coordsize="3510279,6350" o:gfxdata="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" path="m3510013,6350l,6350,,,3510013,r,6350xe" fillcolor="#5e3672" stroked="f">
                 <v:path arrowok="t"/>
                 <w10:wrap type="topAndBottom" anchorx="page"/>
               </v:shape>
@@ -16038,7 +15987,6 @@
           <w:color w:val="565656"/>
           <w:w w:val="90"/>
           <w:sz w:val="18"/>
-          <w:highlight w:val="yellow"/>
         </w:rPr>
         <w:t>HUNEDOARA,</w:t>
       </w:r>
@@ -16048,7 +15996,6 @@
           <w:spacing w:val="-7"/>
           <w:w w:val="90"/>
           <w:sz w:val="18"/>
-          <w:highlight w:val="yellow"/>
         </w:rPr>
         <w:t xml:space="preserve"> </w:t>
       </w:r>
@@ -16058,7 +16005,6 @@
           <w:spacing w:val="-2"/>
           <w:w w:val="90"/>
           <w:sz w:val="18"/>
-          <w:highlight w:val="yellow"/>
         </w:rPr>
         <w:t>ROMÂNIA</w:t>
       </w:r>
@@ -16068,7 +16014,6 @@
           <w:color w:val="565656"/>
           <w:w w:val="90"/>
           <w:sz w:val="20"/>
-          <w:highlight w:val="yellow"/>
         </w:rPr>
         <w:t xml:space="preserve"> </w:t>
       </w:r>
@@ -16077,7 +16022,6 @@
           <w:color w:val="565656"/>
           <w:w w:val="90"/>
           <w:sz w:val="18"/>
-          <w:highlight w:val="yellow"/>
         </w:rPr>
         <w:t>–</w:t>
       </w:r>
@@ -16241,7 +16185,7 @@
           </mc:Choice>
           <mc:Fallback>
             <w:pict>
-              <v:shape w14:anchorId="54614A5B" id="Graphic 39" o:spid="_x0000_s1026" style="position:absolute;margin-left:28.35pt;margin-top:4.2pt;width:276.4pt;height:.5pt;z-index:-251483136;visibility:visible;mso-wrap-style:square;mso-wrap-distance-left:0;mso-wrap-distance-top:0;mso-wrap-distance-right:0;mso-wrap-distance-bottom:0;mso-position-horizontal:absolute;mso-position-horizontal-relative:page;mso-position-vertical:absolute;mso-position-vertical-relative:text;v-text-anchor:top" coordsize="3510279,6350" o:gfxdata="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" path="m3510013,6350l,6350,,,3510013,r,6350xe" fillcolor="#5e3672" stroked="f">
+              <v:shape w14:anchorId="79F635EA" id="Graphic 39" o:spid="_x0000_s1026" style="position:absolute;margin-left:28.35pt;margin-top:4.2pt;width:276.4pt;height:.5pt;z-index:-251483136;visibility:visible;mso-wrap-style:square;mso-wrap-distance-left:0;mso-wrap-distance-top:0;mso-wrap-distance-right:0;mso-wrap-distance-bottom:0;mso-position-horizontal:absolute;mso-position-horizontal-relative:page;mso-position-vertical:absolute;mso-position-vertical-relative:text;v-text-anchor:top" coordsize="3510279,6350" o:gfxdata="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" path="m3510013,6350l,6350,,,3510013,r,6350xe" fillcolor="#5e3672" stroked="f">
                 <v:path arrowok="t"/>
                 <w10:wrap type="topAndBottom" anchorx="page"/>
               </v:shape>
@@ -16897,7 +16841,6 @@
           <w:color w:val="565656"/>
           <w:w w:val="90"/>
           <w:sz w:val="18"/>
-          <w:highlight w:val="yellow"/>
         </w:rPr>
         <w:t>HUNEDOARA,</w:t>
       </w:r>
@@ -16907,7 +16850,6 @@
           <w:spacing w:val="-7"/>
           <w:w w:val="90"/>
           <w:sz w:val="18"/>
-          <w:highlight w:val="yellow"/>
         </w:rPr>
         <w:t xml:space="preserve"> </w:t>
       </w:r>
@@ -16917,7 +16859,6 @@
           <w:spacing w:val="-2"/>
           <w:w w:val="90"/>
           <w:sz w:val="18"/>
-          <w:highlight w:val="yellow"/>
         </w:rPr>
         <w:t>ROMÂNIA</w:t>
       </w:r>
@@ -16927,24 +16868,15 @@
           <w:color w:val="565656"/>
           <w:w w:val="90"/>
           <w:sz w:val="20"/>
-          <w:highlight w:val="yellow"/>
-        </w:rPr>
-        <w:t xml:space="preserve"> </w:t>
-      </w:r>
-      <w:r>
-        <w:rPr>
+        </w:rPr>
+        <w:t xml:space="preserve"> </w:t>
+      </w:r>
+      <w:r>
+        <w:rPr>
+          <w:rFonts w:ascii="Arial Black" w:hAnsi="Arial Black"/>
           <w:color w:val="565656"/>
           <w:w w:val="90"/>
-          <w:sz w:val="18"/>
-          <w:highlight w:val="yellow"/>
-        </w:rPr>
-        <w:t>–</w:t>
-      </w:r>
-      <w:r>
-        <w:rPr>
-          <w:color w:val="565656"/>
-          <w:w w:val="90"/>
-          <w:sz w:val="18"/>
+          <w:sz w:val="20"/>
         </w:rPr>
         <w:t xml:space="preserve"> </w:t>
       </w:r>
@@ -16955,126 +16887,13 @@
           <w:w w:val="90"/>
           <w:sz w:val="20"/>
         </w:rPr>
-        <w:t>MUNCITOR</w:t>
-      </w:r>
-      <w:r>
-        <w:rPr>
-          <w:rFonts w:ascii="Arial Black" w:hAnsi="Arial Black"/>
-          <w:color w:val="F79646" w:themeColor="accent6"/>
-          <w:spacing w:val="-10"/>
-          <w:w w:val="90"/>
-          <w:sz w:val="20"/>
-        </w:rPr>
-        <w:t xml:space="preserve"> </w:t>
-      </w:r>
-      <w:r>
-        <w:rPr>
-          <w:rFonts w:ascii="Arial Black" w:hAnsi="Arial Black"/>
-          <w:color w:val="F79646" w:themeColor="accent6"/>
-          <w:w w:val="90"/>
-          <w:sz w:val="20"/>
-        </w:rPr>
-        <w:t>NECALIFICAT</w:t>
-      </w:r>
-      <w:r>
-        <w:rPr>
-          <w:rFonts w:ascii="Arial Black" w:hAnsi="Arial Black"/>
-          <w:color w:val="F79646" w:themeColor="accent6"/>
-          <w:spacing w:val="-10"/>
-          <w:w w:val="90"/>
-          <w:sz w:val="20"/>
-        </w:rPr>
-        <w:t xml:space="preserve"> </w:t>
-      </w:r>
-      <w:r>
-        <w:rPr>
-          <w:rFonts w:ascii="Arial Black" w:hAnsi="Arial Black"/>
-          <w:color w:val="F79646" w:themeColor="accent6"/>
-          <w:w w:val="90"/>
-          <w:sz w:val="20"/>
-        </w:rPr>
-        <w:t>(HOLOANG</w:t>
-      </w:r>
-      <w:r>
-        <w:rPr>
-          <w:rFonts w:ascii="Arial Black" w:hAnsi="Arial Black"/>
-          <w:color w:val="F79646" w:themeColor="accent6"/>
-          <w:w w:val="85"/>
-          <w:sz w:val="20"/>
-        </w:rPr>
-        <w:t>Ă</w:t>
-      </w:r>
-      <w:r>
-        <w:rPr>
-          <w:rFonts w:ascii="Arial Black" w:hAnsi="Arial Black"/>
-          <w:color w:val="F79646" w:themeColor="accent6"/>
-          <w:w w:val="90"/>
-          <w:sz w:val="20"/>
-        </w:rPr>
-        <w:t>R)</w:t>
+        <w:t>AJUTOR LA FINISAJE SI CONSTRUCTII</w:t>
       </w:r>
       <w:r>
         <w:rPr>
           <w:rFonts w:ascii="Arial Black" w:hAnsi="Arial Black"/>
           <w:color w:val="00B050"/>
           <w:spacing w:val="-11"/>
-          <w:w w:val="90"/>
-          <w:sz w:val="20"/>
-        </w:rPr>
-        <w:t xml:space="preserve"> </w:t>
-      </w:r>
-      <w:r>
-        <w:rPr>
-          <w:rFonts w:ascii="Arial Black" w:hAnsi="Arial Black"/>
-          <w:color w:val="00B050"/>
-          <w:w w:val="90"/>
-          <w:sz w:val="20"/>
-        </w:rPr>
-        <w:t>–</w:t>
-      </w:r>
-      <w:r>
-        <w:rPr>
-          <w:rFonts w:ascii="Arial Black" w:hAnsi="Arial Black"/>
-          <w:color w:val="00B050"/>
-          <w:spacing w:val="-10"/>
-          <w:w w:val="90"/>
-          <w:sz w:val="20"/>
-        </w:rPr>
-        <w:t xml:space="preserve"> </w:t>
-      </w:r>
-      <w:r>
-        <w:rPr>
-          <w:rFonts w:ascii="Arial Black" w:hAnsi="Arial Black"/>
-          <w:color w:val="00B050"/>
-          <w:w w:val="90"/>
-          <w:sz w:val="20"/>
-        </w:rPr>
-        <w:t>LA</w:t>
-      </w:r>
-      <w:r>
-        <w:rPr>
-          <w:rFonts w:ascii="Arial Black" w:hAnsi="Arial Black"/>
-          <w:color w:val="00B050"/>
-          <w:spacing w:val="-10"/>
-          <w:w w:val="90"/>
-          <w:sz w:val="20"/>
-        </w:rPr>
-        <w:t xml:space="preserve"> </w:t>
-      </w:r>
-      <w:r>
-        <w:rPr>
-          <w:rFonts w:ascii="Arial Black" w:hAnsi="Arial Black"/>
-          <w:color w:val="00B050"/>
-          <w:w w:val="90"/>
-          <w:sz w:val="20"/>
-        </w:rPr>
-        <w:t>NEGRU</w:t>
-      </w:r>
-      <w:r>
-        <w:rPr>
-          <w:rFonts w:ascii="Arial Black" w:hAnsi="Arial Black"/>
-          <w:color w:val="00B050"/>
-          <w:spacing w:val="-10"/>
           <w:w w:val="90"/>
           <w:sz w:val="20"/>
         </w:rPr>
@@ -17168,7 +16987,7 @@
           </mc:Choice>
           <mc:Fallback>
             <w:pict>
-              <v:shape w14:anchorId="0E8682BF" id="Graphic 40" o:spid="_x0000_s1026" style="position:absolute;margin-left:28.35pt;margin-top:10.15pt;width:276.4pt;height:.5pt;z-index:-251481088;visibility:visible;mso-wrap-style:square;mso-wrap-distance-left:0;mso-wrap-distance-top:0;mso-wrap-distance-right:0;mso-wrap-distance-bottom:0;mso-position-horizontal:absolute;mso-position-horizontal-relative:page;mso-position-vertical:absolute;mso-position-vertical-relative:text;v-text-anchor:top" coordsize="3510279,6350" o:gfxdata="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" path="m3510013,6350l,6350,,,3510013,r,6350xe" fillcolor="#5e3672" stroked="f">
+              <v:shape w14:anchorId="4493E9C4" id="Graphic 40" o:spid="_x0000_s1026" style="position:absolute;margin-left:28.35pt;margin-top:10.15pt;width:276.4pt;height:.5pt;z-index:-251481088;visibility:visible;mso-wrap-style:square;mso-wrap-distance-left:0;mso-wrap-distance-top:0;mso-wrap-distance-right:0;mso-wrap-distance-bottom:0;mso-position-horizontal:absolute;mso-position-horizontal-relative:page;mso-position-vertical:absolute;mso-position-vertical-relative:text;v-text-anchor:top" coordsize="3510279,6350" o:gfxdata="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" path="m3510013,6350l,6350,,,3510013,r,6350xe" fillcolor="#5e3672" stroked="f">
                 <v:path arrowok="t"/>
                 <w10:wrap type="topAndBottom" anchorx="page"/>
               </v:shape>
@@ -17534,15 +17353,13 @@
           <w:color w:val="565656"/>
           <w:spacing w:val="40"/>
           <w:sz w:val="18"/>
-          <w:highlight w:val="yellow"/>
-        </w:rPr>
-        <w:t xml:space="preserve"> </w:t>
-      </w:r>
-      <w:r>
-        <w:rPr>
-          <w:color w:val="565656"/>
-          <w:sz w:val="18"/>
-          <w:highlight w:val="yellow"/>
+        </w:rPr>
+        <w:t xml:space="preserve"> </w:t>
+      </w:r>
+      <w:r>
+        <w:rPr>
+          <w:color w:val="565656"/>
+          <w:sz w:val="18"/>
         </w:rPr>
         <w:t>HUNEDOARA,</w:t>
       </w:r>
@@ -17551,15 +17368,13 @@
           <w:color w:val="565656"/>
           <w:spacing w:val="-6"/>
           <w:sz w:val="18"/>
-          <w:highlight w:val="yellow"/>
-        </w:rPr>
-        <w:t xml:space="preserve"> </w:t>
-      </w:r>
-      <w:r>
-        <w:rPr>
-          <w:color w:val="565656"/>
-          <w:sz w:val="18"/>
-          <w:highlight w:val="yellow"/>
+        </w:rPr>
+        <w:t xml:space="preserve"> </w:t>
+      </w:r>
+      <w:r>
+        <w:rPr>
+          <w:color w:val="565656"/>
+          <w:sz w:val="18"/>
         </w:rPr>
         <w:t>ROMÂNIA</w:t>
       </w:r>
@@ -17567,7 +17382,6 @@
         <w:rPr>
           <w:color w:val="565656"/>
           <w:sz w:val="18"/>
-          <w:highlight w:val="yellow"/>
         </w:rPr>
         <w:t xml:space="preserve"> -</w:t>
       </w:r>
@@ -17692,7 +17506,7 @@
           </mc:Choice>
           <mc:Fallback>
             <w:pict>
-              <v:shape w14:anchorId="433AE78C" id="Graphic 41" o:spid="_x0000_s1026" style="position:absolute;margin-left:28.35pt;margin-top:10.6pt;width:276.4pt;height:.5pt;z-index:-15718400;visibility:visible;mso-wrap-style:square;mso-wrap-distance-left:0;mso-wrap-distance-top:0;mso-wrap-distance-right:0;mso-wrap-distance-bottom:0;mso-position-horizontal:absolute;mso-position-horizontal-relative:page;mso-position-vertical:absolute;mso-position-vertical-relative:text;v-text-anchor:top" coordsize="3510279,6350" o:gfxdata="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" path="m3510013,6350l,6350,,,3510013,r,6350xe" fillcolor="#5e3672" stroked="f">
+              <v:shape w14:anchorId="1B5EB02B" id="Graphic 41" o:spid="_x0000_s1026" style="position:absolute;margin-left:28.35pt;margin-top:10.6pt;width:276.4pt;height:.5pt;z-index:-15718400;visibility:visible;mso-wrap-style:square;mso-wrap-distance-left:0;mso-wrap-distance-top:0;mso-wrap-distance-right:0;mso-wrap-distance-bottom:0;mso-position-horizontal:absolute;mso-position-horizontal-relative:page;mso-position-vertical:absolute;mso-position-vertical-relative:text;v-text-anchor:top" coordsize="3510279,6350" o:gfxdata="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" path="m3510013,6350l,6350,,,3510013,r,6350xe" fillcolor="#5e3672" stroked="f">
                 <v:path arrowok="t"/>
                 <w10:wrap type="topAndBottom" anchorx="page"/>
               </v:shape>
@@ -18134,7 +17948,7 @@
           </mc:Choice>
           <mc:Fallback>
             <w:pict>
-              <v:shape w14:anchorId="13752E15" id="Graphic 42" o:spid="_x0000_s1026" style="position:absolute;margin-left:28.35pt;margin-top:29.55pt;width:552.8pt;height:1pt;z-index:-251685888;visibility:visible;mso-wrap-style:square;mso-wrap-distance-left:0;mso-wrap-distance-top:0;mso-wrap-distance-right:0;mso-wrap-distance-bottom:0;mso-position-horizontal:absolute;mso-position-horizontal-relative:page;mso-position-vertical:absolute;mso-position-vertical-relative:text;v-text-anchor:top" coordsize="7020559,12700" o:gfxdata="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" path="m7020013,12700l,12700,,,7020013,r,12700xe" fillcolor="#5e3672" stroked="f">
+              <v:shape w14:anchorId="792D4B03" id="Graphic 42" o:spid="_x0000_s1026" style="position:absolute;margin-left:28.35pt;margin-top:29.55pt;width:552.8pt;height:1pt;z-index:-251685888;visibility:visible;mso-wrap-style:square;mso-wrap-distance-left:0;mso-wrap-distance-top:0;mso-wrap-distance-right:0;mso-wrap-distance-bottom:0;mso-position-horizontal:absolute;mso-position-horizontal-relative:page;mso-position-vertical:absolute;mso-position-vertical-relative:text;v-text-anchor:top" coordsize="7020559,12700" o:gfxdata="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" path="m7020013,12700l,12700,,,7020013,r,12700xe" fillcolor="#5e3672" stroked="f">
                 <v:path arrowok="t"/>
                 <w10:wrap type="topAndBottom" anchorx="page"/>
               </v:shape>
@@ -18424,16 +18238,16 @@
           <w:sz w:val="18"/>
         </w:rPr>
         <w:drawing>
-          <wp:anchor distT="0" distB="0" distL="114300" distR="114300" simplePos="0" relativeHeight="251594752" behindDoc="0" locked="0" layoutInCell="1" allowOverlap="1" wp14:anchorId="48319E9D" wp14:editId="2BFDFD56">
+          <wp:anchor distT="0" distB="0" distL="114300" distR="114300" simplePos="0" relativeHeight="251594752" behindDoc="0" locked="0" layoutInCell="1" allowOverlap="1" wp14:anchorId="48319E9D" wp14:editId="631FE158">
             <wp:simplePos x="0" y="0"/>
             <wp:positionH relativeFrom="column">
-              <wp:posOffset>2420522</wp:posOffset>
+              <wp:posOffset>2324100</wp:posOffset>
             </wp:positionH>
             <wp:positionV relativeFrom="paragraph">
-              <wp:posOffset>51972</wp:posOffset>
+              <wp:posOffset>106680</wp:posOffset>
             </wp:positionV>
-            <wp:extent cx="1324708" cy="320718"/>
-            <wp:effectExtent l="0" t="0" r="8890" b="3175"/>
+            <wp:extent cx="1066800" cy="258277"/>
+            <wp:effectExtent l="0" t="0" r="0" b="8890"/>
             <wp:wrapNone/>
             <wp:docPr id="66" name="Picture 66"/>
             <wp:cNvGraphicFramePr>
@@ -18461,7 +18275,7 @@
                   <pic:spPr>
                     <a:xfrm>
                       <a:off x="0" y="0"/>
-                      <a:ext cx="1324708" cy="320718"/>
+                      <a:ext cx="1066800" cy="258277"/>
                     </a:xfrm>
                     <a:prstGeom prst="rect">
                       <a:avLst/>
@@ -18634,7 +18448,7 @@
           </mc:Choice>
           <mc:Fallback>
             <w:pict>
-              <v:shape w14:anchorId="19531B0E" id="Graphic 42" o:spid="_x0000_s1026" style="position:absolute;margin-left:28.35pt;margin-top:29.55pt;width:552.8pt;height:1pt;z-index:-251474944;visibility:visible;mso-wrap-style:square;mso-wrap-distance-left:0;mso-wrap-distance-top:0;mso-wrap-distance-right:0;mso-wrap-distance-bottom:0;mso-position-horizontal:absolute;mso-position-horizontal-relative:page;mso-position-vertical:absolute;mso-position-vertical-relative:text;v-text-anchor:top" coordsize="7020559,12700" o:gfxdata="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" path="m7020013,12700l,12700,,,7020013,r,12700xe" fillcolor="#5e3672" stroked="f">
+              <v:shape w14:anchorId="038B3F7B" id="Graphic 42" o:spid="_x0000_s1026" style="position:absolute;margin-left:28.35pt;margin-top:29.55pt;width:552.8pt;height:1pt;z-index:-251474944;visibility:visible;mso-wrap-style:square;mso-wrap-distance-left:0;mso-wrap-distance-top:0;mso-wrap-distance-right:0;mso-wrap-distance-bottom:0;mso-position-horizontal:absolute;mso-position-horizontal-relative:page;mso-position-vertical:absolute;mso-position-vertical-relative:text;v-text-anchor:top" coordsize="7020559,12700" o:gfxdata="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" path="m7020013,12700l,12700,,,7020013,r,12700xe" fillcolor="#5e3672" stroked="f">
                 <v:path arrowok="t"/>
                 <w10:wrap type="topAndBottom" anchorx="page"/>
               </v:shape>
@@ -20180,16 +19994,16 @@
           <w:noProof/>
         </w:rPr>
         <w:drawing>
-          <wp:anchor distT="0" distB="0" distL="114300" distR="114300" simplePos="0" relativeHeight="251906048" behindDoc="0" locked="0" layoutInCell="1" allowOverlap="1" wp14:anchorId="6561EFFA" wp14:editId="082B174C">
+          <wp:anchor distT="0" distB="0" distL="114300" distR="114300" simplePos="0" relativeHeight="251906048" behindDoc="0" locked="0" layoutInCell="1" allowOverlap="1" wp14:anchorId="6561EFFA" wp14:editId="30F33DA4">
             <wp:simplePos x="0" y="0"/>
             <wp:positionH relativeFrom="column">
-              <wp:posOffset>2357267</wp:posOffset>
+              <wp:posOffset>2354580</wp:posOffset>
             </wp:positionH>
             <wp:positionV relativeFrom="paragraph">
-              <wp:posOffset>186055</wp:posOffset>
+              <wp:posOffset>205740</wp:posOffset>
             </wp:positionV>
-            <wp:extent cx="732692" cy="163162"/>
-            <wp:effectExtent l="0" t="0" r="0" b="8890"/>
+            <wp:extent cx="615928" cy="137160"/>
+            <wp:effectExtent l="0" t="0" r="0" b="0"/>
             <wp:wrapNone/>
             <wp:docPr id="87" name="Graphic 87"/>
             <wp:cNvGraphicFramePr>
@@ -20220,7 +20034,7 @@
                   <pic:spPr>
                     <a:xfrm>
                       <a:off x="0" y="0"/>
-                      <a:ext cx="732692" cy="163162"/>
+                      <a:ext cx="615928" cy="137160"/>
                     </a:xfrm>
                     <a:prstGeom prst="rect">
                       <a:avLst/>
@@ -21766,7 +21580,7 @@
           </mc:Choice>
           <mc:Fallback>
             <w:pict>
-              <v:shape w14:anchorId="6D51AAC1" id="Graphic 47" o:spid="_x0000_s1026" style="position:absolute;margin-left:28.35pt;margin-top:22.2pt;width:552.8pt;height:1pt;z-index:-251517952;visibility:visible;mso-wrap-style:square;mso-wrap-distance-left:0;mso-wrap-distance-top:0;mso-wrap-distance-right:0;mso-wrap-distance-bottom:0;mso-position-horizontal:absolute;mso-position-horizontal-relative:page;mso-position-vertical:absolute;mso-position-vertical-relative:text;v-text-anchor:top" coordsize="7020559,12700" o:gfxdata="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" path="m7020013,12700l,12700,,,7020013,r,12700xe" fillcolor="#5e3672" stroked="f">
+              <v:shape w14:anchorId="15F24337" id="Graphic 47" o:spid="_x0000_s1026" style="position:absolute;margin-left:28.35pt;margin-top:22.2pt;width:552.8pt;height:1pt;z-index:-251517952;visibility:visible;mso-wrap-style:square;mso-wrap-distance-left:0;mso-wrap-distance-top:0;mso-wrap-distance-right:0;mso-wrap-distance-bottom:0;mso-position-horizontal:absolute;mso-position-horizontal-relative:page;mso-position-vertical:absolute;mso-position-vertical-relative:text;v-text-anchor:top" coordsize="7020559,12700" o:gfxdata="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" path="m7020013,12700l,12700,,,7020013,r,12700xe" fillcolor="#5e3672" stroked="f">
                 <v:path arrowok="t"/>
                 <w10:wrap type="topAndBottom" anchorx="page"/>
               </v:shape>
@@ -23911,7 +23725,7 @@
           </mc:Choice>
           <mc:Fallback>
             <w:pict>
-              <v:shape w14:anchorId="76768F55" id="Graphic 49" o:spid="_x0000_s1026" style="position:absolute;margin-left:28.35pt;margin-top:23.6pt;width:552.8pt;height:1pt;z-index:-251684864;visibility:visible;mso-wrap-style:square;mso-wrap-distance-left:0;mso-wrap-distance-top:0;mso-wrap-distance-right:0;mso-wrap-distance-bottom:0;mso-position-horizontal:absolute;mso-position-horizontal-relative:page;mso-position-vertical:absolute;mso-position-vertical-relative:text;v-text-anchor:top" coordsize="7020559,12700" o:gfxdata="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" path="m7020013,12700l,12700,,,7020013,r,12700xe" fillcolor="#5e3672" stroked="f">
+              <v:shape w14:anchorId="753AAAAA" id="Graphic 49" o:spid="_x0000_s1026" style="position:absolute;margin-left:28.35pt;margin-top:23.6pt;width:552.8pt;height:1pt;z-index:-251684864;visibility:visible;mso-wrap-style:square;mso-wrap-distance-left:0;mso-wrap-distance-top:0;mso-wrap-distance-right:0;mso-wrap-distance-bottom:0;mso-position-horizontal:absolute;mso-position-horizontal-relative:page;mso-position-vertical:absolute;mso-position-vertical-relative:text;v-text-anchor:top" coordsize="7020559,12700" o:gfxdata="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" path="m7020013,12700l,12700,,,7020013,r,12700xe" fillcolor="#5e3672" stroked="f">
                 <v:path arrowok="t"/>
                 <w10:wrap type="topAndBottom" anchorx="page"/>
               </v:shape>
@@ -25198,7 +25012,7 @@
           </mc:Choice>
           <mc:Fallback>
             <w:pict>
-              <v:shape w14:anchorId="76965580" id="Graphic 54" o:spid="_x0000_s1026" style="position:absolute;margin-left:28.35pt;margin-top:22.25pt;width:552.8pt;height:1pt;z-index:-251516928;visibility:visible;mso-wrap-style:square;mso-wrap-distance-left:0;mso-wrap-distance-top:0;mso-wrap-distance-right:0;mso-wrap-distance-bottom:0;mso-position-horizontal:absolute;mso-position-horizontal-relative:page;mso-position-vertical:absolute;mso-position-vertical-relative:text;v-text-anchor:top" coordsize="7020559,12700" o:gfxdata="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" path="m7020013,12700l,12700,,,7020013,r,12700xe" fillcolor="#5e3672" stroked="f">
+              <v:shape w14:anchorId="354913EF" id="Graphic 54" o:spid="_x0000_s1026" style="position:absolute;margin-left:28.35pt;margin-top:22.25pt;width:552.8pt;height:1pt;z-index:-251516928;visibility:visible;mso-wrap-style:square;mso-wrap-distance-left:0;mso-wrap-distance-top:0;mso-wrap-distance-right:0;mso-wrap-distance-bottom:0;mso-position-horizontal:absolute;mso-position-horizontal-relative:page;mso-position-vertical:absolute;mso-position-vertical-relative:text;v-text-anchor:top" coordsize="7020559,12700" o:gfxdata="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" path="m7020013,12700l,12700,,,7020013,r,12700xe" fillcolor="#5e3672" stroked="f">
                 <v:path arrowok="t"/>
                 <w10:wrap type="topAndBottom" anchorx="page"/>
               </v:shape>
@@ -25454,7 +25268,7 @@
         <v:path o:extrusionok="f" gradientshapeok="t" o:connecttype="rect"/>
         <o:lock v:ext="edit" aspectratio="t"/>
       </v:shapetype>
-      <v:shape id="_x0000_i1372" type="#_x0000_t75" style="width:11.4pt;height:11.4pt" o:bullet="t">
+      <v:shape id="_x0000_i1045" type="#_x0000_t75" style="width:11.4pt;height:11.4pt" o:bullet="t">
         <v:imagedata r:id="rId1" o:title="image3"/>
       </v:shape>
     </w:pict>

</xml_diff>